<commit_message>
APIs finalizadas e versão final do pré-projeto
</commit_message>
<xml_diff>
--- a/TCC_SIS_2026_1_EduardoGuilherme.docx
+++ b/TCC_SIS_2026_1_EduardoGuilherme.docx
@@ -131,6 +131,7 @@
               </w:rPr>
               <w:t xml:space="preserve">Pré-projeto </w:t>
             </w:r>
+            <w:proofErr w:type="gramStart"/>
             <w:r>
               <w:rPr>
                 <w:rStyle w:val="Nmerodepgina"/>
@@ -144,7 +145,11 @@
               <w:t xml:space="preserve"> </w:t>
             </w:r>
             <w:r>
-              <w:t xml:space="preserve">) </w:t>
+              <w:t>)</w:t>
+            </w:r>
+            <w:proofErr w:type="gramEnd"/>
+            <w:r>
+              <w:t xml:space="preserve"> </w:t>
             </w:r>
             <w:r>
               <w:rPr>
@@ -284,16 +289,35 @@
               <w:rPr>
                 <w:rStyle w:val="Nmerodepgina"/>
               </w:rPr>
-              <w:t>) Aplicado     (</w:t>
-            </w:r>
+              <w:t>) Aplicado  </w:t>
+            </w:r>
+            <w:proofErr w:type="gramStart"/>
             <w:r>
               <w:rPr>
                 <w:rStyle w:val="Nmerodepgina"/>
               </w:rPr>
-              <w:t xml:space="preserve">   </w:t>
-            </w:r>
-            <w:r>
-              <w:t xml:space="preserve">) </w:t>
+              <w:t>   (</w:t>
+            </w:r>
+            <w:proofErr w:type="gramEnd"/>
+            <w:r>
+              <w:rPr>
+                <w:rStyle w:val="Nmerodepgina"/>
+              </w:rPr>
+              <w:t xml:space="preserve"> </w:t>
+            </w:r>
+            <w:proofErr w:type="gramStart"/>
+            <w:r>
+              <w:rPr>
+                <w:rStyle w:val="Nmerodepgina"/>
+              </w:rPr>
+              <w:t xml:space="preserve">  </w:t>
+            </w:r>
+            <w:r>
+              <w:t>)</w:t>
+            </w:r>
+            <w:proofErr w:type="gramEnd"/>
+            <w:r>
+              <w:t xml:space="preserve"> </w:t>
             </w:r>
             <w:r>
               <w:rPr>
@@ -334,12 +358,14 @@
       <w:pPr>
         <w:pStyle w:val="TF-AUTOR0"/>
       </w:pPr>
+      <w:proofErr w:type="spellStart"/>
       <w:r>
         <w:t>Prof</w:t>
       </w:r>
       <w:r>
         <w:t>ª</w:t>
       </w:r>
+      <w:proofErr w:type="spellEnd"/>
       <w:r>
         <w:t xml:space="preserve">. </w:t>
       </w:r>
@@ -357,8 +383,13 @@
       <w:r>
         <w:t xml:space="preserve">Supervisora – </w:t>
       </w:r>
-      <w:r>
-        <w:t>Lucymara Valentini Borges</w:t>
+      <w:proofErr w:type="spellStart"/>
+      <w:r>
+        <w:t>Lucymara</w:t>
+      </w:r>
+      <w:proofErr w:type="spellEnd"/>
+      <w:r>
+        <w:t xml:space="preserve"> Valentini Borges</w:t>
       </w:r>
     </w:p>
     <w:p>
@@ -417,19 +448,51 @@
         <w:t>u</w:t>
       </w:r>
       <w:r>
-        <w:t xml:space="preserve">nior, 2023; Campos; Paiva; Farias, 2021). A aplicação de princípios de usabilidade, associada à adoção de diretrizes de acessibilidade, contribui para o desenvolvimento de sistemas mais eficientes e adequados às necessidades institucionais (Costa, 2018). Nesse contexto, a utilização de boas práticas, como as Heurísticas de Nielsen (HN), o Material Design (MD) e as recomendações das Web Content Accessibility Guidelines (WCAG) 2.2, favorece a construção de interfaces mais consistentes, compreensíveis e acessíveis (Nielsen, </w:t>
+        <w:t xml:space="preserve">nior, 2023; Campos; Paiva; Farias, 2021). A aplicação de princípios de usabilidade, associada à adoção de diretrizes de acessibilidade, contribui para o desenvolvimento de sistemas mais eficientes e adequados às necessidades institucionais (Costa, 2018). Nesse contexto, a utilização de boas práticas, como as Heurísticas de Nielsen (HN), o Material Design (MD) e as recomendações das Web </w:t>
+      </w:r>
+      <w:proofErr w:type="spellStart"/>
+      <w:r>
+        <w:t>Content</w:t>
+      </w:r>
+      <w:proofErr w:type="spellEnd"/>
+      <w:r>
+        <w:t xml:space="preserve"> </w:t>
+      </w:r>
+      <w:proofErr w:type="spellStart"/>
+      <w:r>
+        <w:t>Accessibility</w:t>
+      </w:r>
+      <w:proofErr w:type="spellEnd"/>
+      <w:r>
+        <w:t xml:space="preserve"> </w:t>
+      </w:r>
+      <w:proofErr w:type="spellStart"/>
+      <w:r>
+        <w:t>Guidelines</w:t>
+      </w:r>
+      <w:proofErr w:type="spellEnd"/>
+      <w:r>
+        <w:t xml:space="preserve"> (WCAG) 2.2, favorece a construção de interfaces mais consistentes, compreensíveis e acessíveis (Nielsen, </w:t>
       </w:r>
       <w:r>
         <w:t>2024</w:t>
       </w:r>
       <w:r>
-        <w:t>; Google, 202</w:t>
+        <w:t xml:space="preserve">; Google, </w:t>
+      </w:r>
+      <w:proofErr w:type="gramStart"/>
+      <w:r>
+        <w:t>202</w:t>
       </w:r>
       <w:r>
         <w:t>?</w:t>
       </w:r>
       <w:r>
-        <w:t>; W3C, 202</w:t>
+        <w:t>;</w:t>
+      </w:r>
+      <w:proofErr w:type="gramEnd"/>
+      <w:r>
+        <w:t xml:space="preserve"> W3C, 202</w:t>
       </w:r>
       <w:r>
         <w:t>3</w:t>
@@ -573,7 +636,13 @@
         <w:t>a</w:t>
       </w:r>
       <w:r>
-        <w:t xml:space="preserve">s que embasam esta pesquisa, organizados em duas subseções. Na subseção </w:t>
+        <w:t>s que embasam esta pesquisa, organizad</w:t>
+      </w:r>
+      <w:r>
+        <w:t>a</w:t>
+      </w:r>
+      <w:r>
+        <w:t xml:space="preserve">s em duas subseções. Na subseção </w:t>
       </w:r>
       <w:r>
         <w:fldChar w:fldCharType="begin"/>
@@ -617,21 +686,6 @@
       <w:bookmarkEnd w:id="11"/>
       <w:r>
         <w:t>.</w:t>
-      </w:r>
-      <w:r>
-        <w:fldChar w:fldCharType="begin"/>
-      </w:r>
-      <w:r>
-        <w:instrText xml:space="preserve"> REF _Ref132192873 \r \h </w:instrText>
-      </w:r>
-      <w:r>
-        <w:fldChar w:fldCharType="separate"/>
-      </w:r>
-      <w:r>
-        <w:t>2.1</w:t>
-      </w:r>
-      <w:r>
-        <w:fldChar w:fldCharType="end"/>
       </w:r>
       <w:r>
         <w:t xml:space="preserve"> </w:t>
@@ -789,18 +843,45 @@
         <w:t xml:space="preserve"> 2026)</w:t>
       </w:r>
       <w:r>
-        <w:t xml:space="preserve">. Esse processo contribui para o adequado funcionamento da administração educacional, ao permitir maior controle e acompanhamento das atividades acadêmicas (Unesco, 2023). Para viabilizar essa </w:t>
+        <w:t>. Esse processo contribui para o funcionamento</w:t>
+      </w:r>
+      <w:r>
+        <w:t xml:space="preserve"> adequado</w:t>
+      </w:r>
+      <w:r>
+        <w:t xml:space="preserve"> da administração educacional, ao permitir maior controle e acompanhamento das atividades acadêmicas (Unesco, 2023). Para viabilizar essa </w:t>
       </w:r>
       <w:r>
         <w:lastRenderedPageBreak/>
-        <w:t>organização, torna-se necessária a utilização de sistemas acadêmicos capazes de armazenar e disponibilizar os dados de forma estruturada e segura (Laudon; Laudon, 202</w:t>
+        <w:t>organização, torna-se necessária a utilização de sistemas acadêmicos capazes de armazenar e disponibilizar os dados de forma estruturada e segura (</w:t>
+      </w:r>
+      <w:proofErr w:type="spellStart"/>
+      <w:r>
+        <w:t>Laudon</w:t>
+      </w:r>
+      <w:proofErr w:type="spellEnd"/>
+      <w:r>
+        <w:t xml:space="preserve">; </w:t>
+      </w:r>
+      <w:proofErr w:type="spellStart"/>
+      <w:r>
+        <w:t>Laudon</w:t>
+      </w:r>
+      <w:proofErr w:type="spellEnd"/>
+      <w:r>
+        <w:t>, 202</w:t>
       </w:r>
       <w:r>
         <w:t>2</w:t>
       </w:r>
       <w:r>
-        <w:t>). Nesse contexto, a informatização contribui para a redução de inconsistências nos dados e amplia a agilidade no acesso às informações no cotidiano institucional (Turban</w:t>
-      </w:r>
+        <w:t>). Nesse contexto, a informatização contribui para a redução de inconsistências nos dados e amplia a agilidade no acesso às informações no cotidiano institucional (</w:t>
+      </w:r>
+      <w:proofErr w:type="spellStart"/>
+      <w:r>
+        <w:t>Turban</w:t>
+      </w:r>
+      <w:proofErr w:type="spellEnd"/>
       <w:r>
         <w:t>; Pollard; Wood</w:t>
       </w:r>
@@ -820,7 +901,23 @@
         <w:t>Esse</w:t>
       </w:r>
       <w:r>
-        <w:t xml:space="preserve"> contexto possibilita o acesso a dados relevantes por parte de estudantes e instituições com maior rapidez e praticidade. Informações como notas, avisos e prazos passam a ser compartilhadas de forma mais direta, o que favorece a organização das atividades acadêmicas (Laudon; Laudon, 202</w:t>
+        <w:t xml:space="preserve"> contexto possibilita o acesso a dados relevantes por parte de estudantes e instituições com maior rapidez e praticidade. Informações como notas, avisos e prazos passam a ser compartilhadas de forma mais direta, o que favorece a organização das atividades acadêmicas (</w:t>
+      </w:r>
+      <w:proofErr w:type="spellStart"/>
+      <w:r>
+        <w:t>Laudon</w:t>
+      </w:r>
+      <w:proofErr w:type="spellEnd"/>
+      <w:r>
+        <w:t xml:space="preserve">; </w:t>
+      </w:r>
+      <w:proofErr w:type="spellStart"/>
+      <w:r>
+        <w:t>Laudon</w:t>
+      </w:r>
+      <w:proofErr w:type="spellEnd"/>
+      <w:r>
+        <w:t>, 202</w:t>
       </w:r>
       <w:r>
         <w:t>2</w:t>
@@ -853,7 +950,17 @@
         <w:t xml:space="preserve"> (</w:t>
       </w:r>
       <w:r>
-        <w:t>Sun; Chen, 2021</w:t>
+        <w:t xml:space="preserve">Leite </w:t>
+      </w:r>
+      <w:r>
+        <w:rPr>
+          <w:i/>
+          <w:iCs/>
+        </w:rPr>
+        <w:t>et al</w:t>
+      </w:r>
+      <w:r>
+        <w:t>., 2026</w:t>
       </w:r>
       <w:r>
         <w:t>)</w:t>
@@ -861,11 +968,24 @@
       <w:r>
         <w:t>. A ausência de comunicação adequada entre diferentes plataformas pode ocasionar atrasos na divulgação de dados e inconsistências nas informações disponibilizadas (</w:t>
       </w:r>
-      <w:r>
-        <w:t>Turban; Pollard; Wood</w:t>
-      </w:r>
-      <w:r>
-        <w:t xml:space="preserve">, 2021; Kroenke; </w:t>
+      <w:proofErr w:type="spellStart"/>
+      <w:r>
+        <w:t>Turban</w:t>
+      </w:r>
+      <w:proofErr w:type="spellEnd"/>
+      <w:r>
+        <w:t>; Pollard; Wood</w:t>
+      </w:r>
+      <w:r>
+        <w:t xml:space="preserve">, 2021; </w:t>
+      </w:r>
+      <w:proofErr w:type="spellStart"/>
+      <w:r>
+        <w:t>Kroenke</w:t>
+      </w:r>
+      <w:proofErr w:type="spellEnd"/>
+      <w:r>
+        <w:t xml:space="preserve">; </w:t>
       </w:r>
       <w:r>
         <w:t>Boyle</w:t>
@@ -937,7 +1057,15 @@
         <w:t>)</w:t>
       </w:r>
       <w:r>
-        <w:t xml:space="preserve">. Como resultado, favorece-se uma gestão acadêmica mais organizada, com maior consistência informacional e alinhamento às demandas institucionais (Kroenke; </w:t>
+        <w:t>. Como resultado, favorece-se uma gestão acadêmica mais organizada, com maior consistência informacional e alinhamento às demandas institucionais (</w:t>
+      </w:r>
+      <w:proofErr w:type="spellStart"/>
+      <w:r>
+        <w:t>Kroenke</w:t>
+      </w:r>
+      <w:proofErr w:type="spellEnd"/>
+      <w:r>
+        <w:t xml:space="preserve">; </w:t>
       </w:r>
       <w:r>
         <w:t xml:space="preserve">Boyle, </w:t>
@@ -972,17 +1100,49 @@
       <w:r>
         <w:t>Os sistemas integrados de gestão correspondem a soluções tecnológicas destinadas à organização e centralização das informações institucionais em um único ambiente (</w:t>
       </w:r>
-      <w:r>
-        <w:t>Laudon; Laudon, 202</w:t>
+      <w:proofErr w:type="spellStart"/>
+      <w:r>
+        <w:t>Laudon</w:t>
+      </w:r>
+      <w:proofErr w:type="spellEnd"/>
+      <w:r>
+        <w:t xml:space="preserve">; </w:t>
+      </w:r>
+      <w:proofErr w:type="spellStart"/>
+      <w:r>
+        <w:t>Laudon</w:t>
+      </w:r>
+      <w:proofErr w:type="spellEnd"/>
+      <w:r>
+        <w:t>, 202</w:t>
       </w:r>
       <w:r>
         <w:t>2</w:t>
       </w:r>
       <w:r>
-        <w:t>). Essas ferramentas possibilitam a integração de diferentes processos organizacionais, promovendo maior controle e análise estruturada dos dados (Coutinho, 2024). A unificação das informações permite que áreas como financeiro, recursos humanos e operações compartilhem a mesma base de dados (</w:t>
-      </w:r>
-      <w:r>
-        <w:t>Turban; Pollard; Wood</w:t>
+        <w:t>). Essas ferramentas possibilitam a integração de diferentes processos organizacionais, promovendo maior controle e análise estruturada dos dados (</w:t>
+      </w:r>
+      <w:r>
+        <w:t>Cavalcante</w:t>
+      </w:r>
+      <w:r>
+        <w:t xml:space="preserve">; Junior; </w:t>
+      </w:r>
+      <w:proofErr w:type="spellStart"/>
+      <w:r>
+        <w:t>Ceolin</w:t>
+      </w:r>
+      <w:proofErr w:type="spellEnd"/>
+      <w:r>
+        <w:t>, 2024). A unificação das informações permite que áreas como financeiro, recursos humanos e operações compartilhem a mesma base de dados (</w:t>
+      </w:r>
+      <w:proofErr w:type="spellStart"/>
+      <w:r>
+        <w:t>Turban</w:t>
+      </w:r>
+      <w:proofErr w:type="spellEnd"/>
+      <w:r>
+        <w:t>; Pollard; Wood</w:t>
       </w:r>
       <w:r>
         <w:t xml:space="preserve">, </w:t>
@@ -991,7 +1151,13 @@
         <w:t>2021</w:t>
       </w:r>
       <w:r>
-        <w:t>). Como resultado, observa-se melhoria na comunicação interna e redução de inconsistências informacionais, o que favorece decisões mais ágeis e fundamentadas (Bizinoto, 2025).</w:t>
+        <w:t>). Como resultado, observa-se melhoria na comunicação interna e redução de inconsistências informacionais, o que favorece decisões mais ágeis e fundamentadas (</w:t>
+      </w:r>
+      <w:r>
+        <w:t>Neves; Azevedo; Lélis, 2024</w:t>
+      </w:r>
+      <w:r>
+        <w:t>).</w:t>
       </w:r>
     </w:p>
     <w:p>
@@ -999,6 +1165,7 @@
         <w:pStyle w:val="TF-TEXTO"/>
       </w:pPr>
       <w:r>
+        <w:lastRenderedPageBreak/>
         <w:t>A integração e a centralização das informações, características desses sistemas, configuram-se como benefícios relevantes no contexto organizacional (</w:t>
       </w:r>
       <w:r>
@@ -1011,11 +1178,19 @@
         <w:t>2023</w:t>
       </w:r>
       <w:r>
-        <w:t xml:space="preserve">). A </w:t>
-      </w:r>
-      <w:r>
-        <w:lastRenderedPageBreak/>
-        <w:t>consolidação dos dados em um único ambiente possibilita maior controle das operações e contribui para o aumento da eficiência dos processos internos (Angelo, 2024). Além disso, a integração favorece o acompanhamento das atividades em tempo próximo ao real, o que amplia a capacidade de monitoramento e gestão (</w:t>
+        <w:t>). A consolidação dos dados em um único ambiente possibilita maior controle das operações e contribui para o aumento da eficiência dos processos internos (</w:t>
+      </w:r>
+      <w:r>
+        <w:t>Oliveira; Carvalhaes</w:t>
+      </w:r>
+      <w:r>
+        <w:t>, 202</w:t>
+      </w:r>
+      <w:r>
+        <w:t>0</w:t>
+      </w:r>
+      <w:r>
+        <w:t>). Além disso, a integração favorece o acompanhamento das atividades em tempo próximo ao real, o que amplia a capacidade de monitoramento e gestão (</w:t>
       </w:r>
       <w:r>
         <w:t>CGI.br</w:t>
@@ -1030,7 +1205,7 @@
         <w:t>). Esse cenário promove maior articulação entre os setores, permitindo melhor aproveitamento das informações disponíveis (</w:t>
       </w:r>
       <w:r>
-        <w:t>Davenport; Bean, 2022</w:t>
+        <w:t>Batista, 2025</w:t>
       </w:r>
       <w:r>
         <w:t xml:space="preserve">). </w:t>
@@ -1053,7 +1228,19 @@
         <w:t xml:space="preserve"> 2023</w:t>
       </w:r>
       <w:r>
-        <w:t>). A integração entre áreas amplia a eficiência da comunicação e contribui para maior capacidade de resposta diante de mudanças no ambiente organizacional (Avvale, 2025). Ainda que a implementação demande adaptações estruturais e operacionais, os benefícios tendem a se consolidar ao longo do tempo (</w:t>
+        <w:t>). A integração entre áreas amplia a eficiência da comunicação e contribui para maior capacidade de resposta diante de mudanças no ambiente organizacional (</w:t>
+      </w:r>
+      <w:r>
+        <w:t>Neves; Azevedo; Lélis</w:t>
+      </w:r>
+      <w:r>
+        <w:t>, 202</w:t>
+      </w:r>
+      <w:r>
+        <w:t>4</w:t>
+      </w:r>
+      <w:r>
+        <w:t>). Ainda que a implementação demande adaptações estruturais e operacionais, os benefícios tendem a se consolidar ao longo do tempo (</w:t>
       </w:r>
       <w:r>
         <w:t>Oracle, 2022</w:t>
@@ -1144,6 +1331,7 @@
         <w:pStyle w:val="TF-TEXTO"/>
       </w:pPr>
       <w:r>
+        <w:lastRenderedPageBreak/>
         <w:t>No âmbito da acessibilidade, destacam-se as diretrizes estabelecidas pelo W3C por meio das WCAG</w:t>
       </w:r>
       <w:r>
@@ -1152,9 +1340,11 @@
       <w:r>
         <w:t>, voltadas ao desenvolvimento de sistemas digitais acessíveis (</w:t>
       </w:r>
+      <w:proofErr w:type="spellStart"/>
       <w:r>
         <w:t>Matiuzzo</w:t>
       </w:r>
+      <w:proofErr w:type="spellEnd"/>
       <w:r>
         <w:t>, 202</w:t>
       </w:r>
@@ -1162,18 +1352,16 @@
         <w:t>4</w:t>
       </w:r>
       <w:r>
-        <w:t xml:space="preserve">). Essas diretrizes são estruturadas em níveis de conformidade denominados A, AA e AAA, que </w:t>
-      </w:r>
-      <w:r>
-        <w:lastRenderedPageBreak/>
-        <w:t xml:space="preserve">representam diferentes graus de acessibilidade </w:t>
+        <w:t xml:space="preserve">). Essas diretrizes são estruturadas em níveis de conformidade denominados A, AA e AAA, que representam diferentes graus de acessibilidade </w:t>
       </w:r>
       <w:r>
         <w:t>(</w:t>
       </w:r>
+      <w:proofErr w:type="spellStart"/>
       <w:r>
         <w:t>Sabilano</w:t>
       </w:r>
+      <w:proofErr w:type="spellEnd"/>
       <w:r>
         <w:t>,</w:t>
       </w:r>
@@ -1195,9 +1383,11 @@
       <w:r>
         <w:t>(</w:t>
       </w:r>
+      <w:proofErr w:type="spellStart"/>
       <w:r>
         <w:t>Sabilano</w:t>
       </w:r>
+      <w:proofErr w:type="spellEnd"/>
       <w:r>
         <w:t xml:space="preserve">, </w:t>
       </w:r>
@@ -1413,6 +1603,7 @@
       <w:r>
         <w:t xml:space="preserve">foi definida por meio da elaboração de uma </w:t>
       </w:r>
+      <w:proofErr w:type="spellStart"/>
       <w:r>
         <w:rPr>
           <w:i/>
@@ -1420,6 +1611,7 @@
         </w:rPr>
         <w:t>string</w:t>
       </w:r>
+      <w:proofErr w:type="spellEnd"/>
       <w:r>
         <w:t xml:space="preserve"> estruturada com termos e palavras-chave relacionados ao tema, </w:t>
       </w:r>
@@ -1453,6 +1645,7 @@
       <w:r>
         <w:t xml:space="preserve"> A </w:t>
       </w:r>
+      <w:proofErr w:type="spellStart"/>
       <w:r>
         <w:rPr>
           <w:i/>
@@ -1460,6 +1653,7 @@
         </w:rPr>
         <w:t>string</w:t>
       </w:r>
+      <w:proofErr w:type="spellEnd"/>
       <w:r>
         <w:t xml:space="preserve"> utilizada foi</w:t>
       </w:r>
@@ -1632,6 +1826,7 @@
       <w:r>
         <w:t xml:space="preserve">A definição da </w:t>
       </w:r>
+      <w:proofErr w:type="spellStart"/>
       <w:r>
         <w:rPr>
           <w:i/>
@@ -1639,6 +1834,7 @@
         </w:rPr>
         <w:t>string</w:t>
       </w:r>
+      <w:proofErr w:type="spellEnd"/>
       <w:r>
         <w:t xml:space="preserve"> ocorreu após </w:t>
       </w:r>
@@ -1658,7 +1854,11 @@
         <w:t xml:space="preserve">, sendo </w:t>
       </w:r>
       <w:r>
-        <w:t>selecionada aquela que apresentou resultados mais alinhados ao objetivo do estudo. Durante esse processo, termos como “saúde mental” e variações semelhantes também foram considerados</w:t>
+        <w:t xml:space="preserve">selecionada aquela que apresentou resultados mais alinhados ao objetivo do estudo. Durante esse processo, </w:t>
+      </w:r>
+      <w:r>
+        <w:lastRenderedPageBreak/>
+        <w:t>termos como “saúde mental” e variações semelhantes também foram considerados</w:t>
       </w:r>
       <w:r>
         <w:t xml:space="preserve">, porém </w:t>
@@ -1693,7 +1893,6 @@
         <w:pStyle w:val="TF-TEXTO"/>
       </w:pPr>
       <w:r>
-        <w:lastRenderedPageBreak/>
         <w:t xml:space="preserve">Para garantir rigor na seleção dos materiais analisados, foram estabelecidos Critérios de Inclusão (CI) e Critérios de Exclusão (CE), utilizados para avaliar e filtrar os estudos obtidos. Santos, Ferreira e Prates (2012 </w:t>
       </w:r>
       <w:r>
@@ -2853,6 +3052,7 @@
         <w:t xml:space="preserve">dois artigos </w:t>
       </w:r>
       <w:r>
+        <w:lastRenderedPageBreak/>
         <w:t xml:space="preserve">com </w:t>
       </w:r>
       <w:r>
@@ -2898,7 +3098,6 @@
       </w:pPr>
       <w:bookmarkStart w:id="20" w:name="_Ref129893649"/>
       <w:r>
-        <w:lastRenderedPageBreak/>
         <w:t xml:space="preserve">Tabela </w:t>
       </w:r>
       <w:r>
@@ -3322,8 +3521,21 @@
       <w:r>
         <w:t xml:space="preserve">soluções: </w:t>
       </w:r>
-      <w:r>
-        <w:t>Salesforce Education Cloud</w:t>
+      <w:proofErr w:type="spellStart"/>
+      <w:r>
+        <w:t>Salesforce</w:t>
+      </w:r>
+      <w:proofErr w:type="spellEnd"/>
+      <w:r>
+        <w:t xml:space="preserve"> </w:t>
+      </w:r>
+      <w:proofErr w:type="spellStart"/>
+      <w:r>
+        <w:t>Education</w:t>
+      </w:r>
+      <w:proofErr w:type="spellEnd"/>
+      <w:r>
+        <w:t xml:space="preserve"> Cloud</w:t>
       </w:r>
       <w:r>
         <w:t xml:space="preserve">, </w:t>
@@ -3334,21 +3546,43 @@
       <w:r>
         <w:t xml:space="preserve">, </w:t>
       </w:r>
-      <w:r>
-        <w:t>Ellucian Student</w:t>
-      </w:r>
+      <w:proofErr w:type="spellStart"/>
+      <w:r>
+        <w:t>Ellucian</w:t>
+      </w:r>
+      <w:proofErr w:type="spellEnd"/>
+      <w:r>
+        <w:t xml:space="preserve"> </w:t>
+      </w:r>
+      <w:proofErr w:type="spellStart"/>
+      <w:r>
+        <w:t>Student</w:t>
+      </w:r>
+      <w:proofErr w:type="spellEnd"/>
       <w:r>
         <w:t xml:space="preserve">, </w:t>
       </w:r>
+      <w:proofErr w:type="spellStart"/>
       <w:r>
         <w:t>openSIS</w:t>
       </w:r>
+      <w:proofErr w:type="spellEnd"/>
       <w:r>
         <w:t xml:space="preserve">, </w:t>
       </w:r>
-      <w:r>
-        <w:t>Workday Student</w:t>
-      </w:r>
+      <w:proofErr w:type="spellStart"/>
+      <w:r>
+        <w:t>Workday</w:t>
+      </w:r>
+      <w:proofErr w:type="spellEnd"/>
+      <w:r>
+        <w:t xml:space="preserve"> </w:t>
+      </w:r>
+      <w:proofErr w:type="spellStart"/>
+      <w:r>
+        <w:t>Student</w:t>
+      </w:r>
+      <w:proofErr w:type="spellEnd"/>
       <w:r>
         <w:t xml:space="preserve">. Após análise </w:t>
       </w:r>
@@ -3358,9 +3592,19 @@
       <w:r>
         <w:t xml:space="preserve">o sistema </w:t>
       </w:r>
-      <w:r>
-        <w:t>Ellucian Student</w:t>
-      </w:r>
+      <w:proofErr w:type="spellStart"/>
+      <w:r>
+        <w:t>Ellucian</w:t>
+      </w:r>
+      <w:proofErr w:type="spellEnd"/>
+      <w:r>
+        <w:t xml:space="preserve"> </w:t>
+      </w:r>
+      <w:proofErr w:type="spellStart"/>
+      <w:r>
+        <w:t>Student</w:t>
+      </w:r>
+      <w:proofErr w:type="spellEnd"/>
       <w:r>
         <w:t xml:space="preserve"> </w:t>
       </w:r>
@@ -3686,12 +3930,21 @@
               </w:rPr>
             </w:pPr>
             <w:bookmarkStart w:id="22" w:name="_Hlk129938310"/>
-            <w:r>
-              <w:rPr>
-                <w:sz w:val="18"/>
-                <w:szCs w:val="18"/>
-              </w:rPr>
-              <w:t>EduMaster: Gerenciador de matrículas de alunos com deficiência para o controle e encaminhamento ao atendimento educacional especializado</w:t>
+            <w:proofErr w:type="spellStart"/>
+            <w:r>
+              <w:rPr>
+                <w:sz w:val="18"/>
+                <w:szCs w:val="18"/>
+              </w:rPr>
+              <w:t>EduMaster</w:t>
+            </w:r>
+            <w:proofErr w:type="spellEnd"/>
+            <w:r>
+              <w:rPr>
+                <w:sz w:val="18"/>
+                <w:szCs w:val="18"/>
+              </w:rPr>
+              <w:t>: Gerenciador de matrículas de alunos com deficiência para o controle e encaminhamento ao atendimento educacional especializado</w:t>
             </w:r>
           </w:p>
         </w:tc>
@@ -3756,6 +4009,7 @@
               </w:rPr>
             </w:pPr>
             <w:bookmarkStart w:id="23" w:name="OLE_LINK7"/>
+            <w:proofErr w:type="spellStart"/>
             <w:r>
               <w:rPr>
                 <w:i/>
@@ -3765,6 +4019,7 @@
               </w:rPr>
               <w:t>String</w:t>
             </w:r>
+            <w:proofErr w:type="spellEnd"/>
             <w:r>
               <w:rPr>
                 <w:sz w:val="18"/>
@@ -3992,6 +4247,7 @@
                 <w:szCs w:val="18"/>
               </w:rPr>
             </w:pPr>
+            <w:proofErr w:type="spellStart"/>
             <w:r>
               <w:rPr>
                 <w:i/>
@@ -4001,6 +4257,7 @@
               </w:rPr>
               <w:t>String</w:t>
             </w:r>
+            <w:proofErr w:type="spellEnd"/>
             <w:r>
               <w:rPr>
                 <w:sz w:val="18"/>
@@ -4180,6 +4437,7 @@
                 <w:szCs w:val="18"/>
               </w:rPr>
             </w:pPr>
+            <w:proofErr w:type="spellStart"/>
             <w:r>
               <w:rPr>
                 <w:sz w:val="18"/>
@@ -4187,6 +4445,7 @@
               </w:rPr>
               <w:t>ChatGpt</w:t>
             </w:r>
+            <w:proofErr w:type="spellEnd"/>
           </w:p>
         </w:tc>
         <w:tc>
@@ -4361,11 +4620,19 @@
         <w:t xml:space="preserve"> resultados, </w:t>
       </w:r>
       <w:r>
-        <w:t xml:space="preserve">sendo dois provenientes da revisão sistemática da literatura (RSL) e um da revisão tradicional da literatura (RTL). O estudo de Bandeira Júnior (2025) apresenta o sistema EduMaster, uma aplicação web voltada à gestão de matrículas de estudantes com deficiência, que permite o cadastro, o acompanhamento e o encaminhamento ao Atendimento Educacional Especializado (AEE), além de favorecer a comunicação entre secretaria e docentes. De forma complementar, o sistema Sigma, proposto por Silva (2019), consiste em uma solução composta por aplicação móvel integrada a um ambiente web, direcionada ao registro e acompanhamento de estudantes com necessidades educacionais </w:t>
+        <w:t xml:space="preserve">sendo dois provenientes da revisão sistemática da literatura (RSL) e um da revisão tradicional da literatura (RTL). O estudo de Bandeira Júnior (2025) apresenta o sistema </w:t>
+      </w:r>
+      <w:proofErr w:type="spellStart"/>
+      <w:r>
+        <w:t>EduMaster</w:t>
+      </w:r>
+      <w:proofErr w:type="spellEnd"/>
+      <w:r>
+        <w:t xml:space="preserve">, uma aplicação web voltada à gestão de matrículas de estudantes com deficiência, que permite o cadastro, o acompanhamento e o encaminhamento ao Atendimento Educacional Especializado (AEE), além de favorecer a comunicação entre secretaria e docentes. De forma complementar, o sistema Sigma, proposto por Silva (2019), </w:t>
       </w:r>
       <w:r>
         <w:lastRenderedPageBreak/>
-        <w:t>específicas. A ferramenta contempla funcionalidades como cadastro de alunos, registro de eventos, geração de documentos e armazenamento seguro de dados, contribuindo para a organização e a padronização do atendimento educacional especializado.</w:t>
+        <w:t>consiste em uma solução composta por aplicação móvel integrada a um ambiente web, direcionada ao registro e acompanhamento de estudantes com necessidades educacionais específicas. A ferramenta contempla funcionalidades como cadastro de alunos, registro de eventos, geração de documentos e armazenamento seguro de dados, contribuindo para a organização e a padronização do atendimento educacional especializado.</w:t>
       </w:r>
     </w:p>
     <w:p>
@@ -4381,7 +4648,39 @@
         <w:pStyle w:val="TF-TEXTO"/>
       </w:pPr>
       <w:r>
-        <w:t>Adicionalmente, a plataforma Ellucian Student (2024) configura-se como uma solução integrada de gestão acadêmica amplamente utilizada em instituições de ensino superior. A ferramenta oferece funcionalidades abrangentes para o gerenciamento do ciclo de vida do estudante, incluindo cadastro, histórico acadêmico e painéis administrativos. Sua estrutura permite a centralização das informações institucionais e a automação de processos acadêmicos. Dessa forma, contribui para o aprimoramento da gestão educacional e para a organização dos dados ao longo da trajetória estudantil (Ellucian Student, 2024)</w:t>
+        <w:t xml:space="preserve">Adicionalmente, a plataforma </w:t>
+      </w:r>
+      <w:proofErr w:type="spellStart"/>
+      <w:r>
+        <w:t>Ellucian</w:t>
+      </w:r>
+      <w:proofErr w:type="spellEnd"/>
+      <w:r>
+        <w:t xml:space="preserve"> </w:t>
+      </w:r>
+      <w:proofErr w:type="spellStart"/>
+      <w:r>
+        <w:t>Student</w:t>
+      </w:r>
+      <w:proofErr w:type="spellEnd"/>
+      <w:r>
+        <w:t xml:space="preserve"> (2024) configura-se como uma solução integrada de gestão acadêmica amplamente utilizada em instituições de ensino superior. A ferramenta oferece funcionalidades abrangentes para o gerenciamento do ciclo de vida do estudante, incluindo cadastro, histórico acadêmico e painéis administrativos. Sua estrutura permite a centralização das informações institucionais e a automação de processos acadêmicos. Dessa forma, contribui para o aprimoramento da gestão educacional e para a organização dos dados ao longo da trajetória estudantil (</w:t>
+      </w:r>
+      <w:proofErr w:type="spellStart"/>
+      <w:r>
+        <w:t>Ellucian</w:t>
+      </w:r>
+      <w:proofErr w:type="spellEnd"/>
+      <w:r>
+        <w:t xml:space="preserve"> </w:t>
+      </w:r>
+      <w:proofErr w:type="spellStart"/>
+      <w:r>
+        <w:t>Student</w:t>
+      </w:r>
+      <w:proofErr w:type="spellEnd"/>
+      <w:r>
+        <w:t>, 2024)</w:t>
       </w:r>
       <w:r>
         <w:t>.</w:t>
@@ -4466,7 +4765,11 @@
         <w:t>et al</w:t>
       </w:r>
       <w:r>
-        <w:t>., 2025). A comunicação entre sistemas acadêmicos também favorece a integração institucional ao viabilizar a interoperabilidade e a troca de dados entre diferentes plataformas, assegurando consistência e continuidade no fluxo informacional (Inocêncio; Pereira; Martina, 2024). Dessa forma, a adoção dessas tecnologias contribui para a redução de processos manuais, para a diminuição do retrabalho e para o aumento da eficiência nos atendimentos institucionais.</w:t>
+        <w:t xml:space="preserve">., 2025). A comunicação entre sistemas acadêmicos também favorece a integração institucional ao viabilizar a interoperabilidade e a troca de dados entre diferentes plataformas, assegurando consistência e continuidade no fluxo informacional (Inocêncio; Pereira; Martina, 2024). Dessa </w:t>
+      </w:r>
+      <w:r>
+        <w:lastRenderedPageBreak/>
+        <w:t>forma, a adoção dessas tecnologias contribui para a redução de processos manuais, para a diminuição do retrabalho e para o aumento da eficiência nos atendimentos institucionais.</w:t>
       </w:r>
     </w:p>
     <w:p>
@@ -4474,7 +4777,6 @@
         <w:pStyle w:val="TF-TEXTO"/>
       </w:pPr>
       <w:r>
-        <w:lastRenderedPageBreak/>
         <w:t>Os sistemas integrados de gestão contribuem para a melhoria dos processos organizacionais ao promoverem a integração, a centralização e a padronização das informações institucionais (Oliveira, 2025). Conforme Dias (2022), esses sistemas ampliam o controle e a confiabilidade dos dados, além de favorecerem a comunicação entre diferentes áreas da organização. A adoção dessas soluções no contexto da CAE está relacionada à qualificação do suporte à tomada de decisão e ao acompanhamento dos atendimentos realizados, em consonância com as demandas institucionais.</w:t>
       </w:r>
     </w:p>
@@ -4514,7 +4816,15 @@
         <w:t>?</w:t>
       </w:r>
       <w:r>
-        <w:t>). Em paralelo, a acessibilidade busca assegurar que diferentes perfis de usuários consigam utilizar os sistemas de forma adequada, incluindo aqueles com limitações físicas ou cognitivas (Pablos; Feitosa, 2020). Nesse sentido, as recomendações das WCAG estabelecem diretrizes que contribuem para a construção de interfaces mais inclusivas. A adoção conjunta desses princípios favorece o desenvolvimento de soluções mais adequadas ao contexto de uso</w:t>
+        <w:t>). Em paralelo, a acessibilidade busca assegurar que diferentes perfis de usuários consigam utilizar os sistemas de forma adequada, incluindo aqueles com limitações físicas ou cognitivas (</w:t>
+      </w:r>
+      <w:proofErr w:type="spellStart"/>
+      <w:r>
+        <w:t>Pablos</w:t>
+      </w:r>
+      <w:proofErr w:type="spellEnd"/>
+      <w:r>
+        <w:t>; Feitosa, 2020). Nesse sentido, as recomendações das WCAG estabelecem diretrizes que contribuem para a construção de interfaces mais inclusivas. A adoção conjunta desses princípios favorece o desenvolvimento de soluções mais adequadas ao contexto de uso</w:t>
       </w:r>
       <w:r>
         <w:t xml:space="preserve"> (Costa, 2018)</w:t>
@@ -4528,7 +4838,39 @@
         <w:pStyle w:val="TF-TEXTO"/>
       </w:pPr>
       <w:r>
-        <w:t>Estudos como os de Bandeira Júnior (2025), Silva (2019) e o sistema Ellucian Student (2024) evidenciam a aplicação de soluções digitais na gestão acadêmica. O trabalho de Bandeira Júnior (2025) apresenta um sistema web voltado ao gerenciamento de matrículas de estudantes com deficiência, com funcionalidades de cadastro, atualização de informações e encaminhamento ao atendimento educacional especializado, além de promover a comunicação entre secretaria e docentes. O estudo de Silva (2019) propõe uma aplicação móvel destinada ao acompanhamento de estudantes com necessidades educacionais específicas, permitindo o registro e a consulta de informações pedagógicas, com foco na organização do trabalho docente. O sistema Ellucian Student (2024) apresenta uma solução integrada, com funcionalidades relacionadas à gestão do histórico acadêmico, cadastro de estudantes e automação de processos institucionais. Essas soluções demonstram contribuições para a gestão educacional e evidenciam o potencial das tecnologias digitais nesse contexto. No entanto, identificam-se limitações quanto à adaptação a diferentes realidades institucionais e ao escopo de aplicação. Diante disso, verifica-se a necessidade de desenvolvimento de um sistema que atenda de forma mais específica às demandas da CAE</w:t>
+        <w:t xml:space="preserve">Estudos como os de Bandeira Júnior (2025), Silva (2019) e o sistema </w:t>
+      </w:r>
+      <w:proofErr w:type="spellStart"/>
+      <w:r>
+        <w:t>Ellucian</w:t>
+      </w:r>
+      <w:proofErr w:type="spellEnd"/>
+      <w:r>
+        <w:t xml:space="preserve"> </w:t>
+      </w:r>
+      <w:proofErr w:type="spellStart"/>
+      <w:r>
+        <w:t>Student</w:t>
+      </w:r>
+      <w:proofErr w:type="spellEnd"/>
+      <w:r>
+        <w:t xml:space="preserve"> (2024) evidenciam a aplicação de soluções digitais na gestão acadêmica. O trabalho de Bandeira Júnior (2025) apresenta um sistema web voltado ao gerenciamento de matrículas de estudantes com deficiência, com funcionalidades de cadastro, atualização de informações e encaminhamento ao atendimento educacional especializado, além de promover a comunicação entre secretaria e docentes. O estudo de Silva (2019) propõe uma aplicação móvel destinada ao acompanhamento de estudantes com necessidades educacionais específicas, permitindo o registro e a consulta de informações pedagógicas, com foco na organização do trabalho docente. O sistema </w:t>
+      </w:r>
+      <w:proofErr w:type="spellStart"/>
+      <w:r>
+        <w:t>Ellucian</w:t>
+      </w:r>
+      <w:proofErr w:type="spellEnd"/>
+      <w:r>
+        <w:t xml:space="preserve"> </w:t>
+      </w:r>
+      <w:proofErr w:type="spellStart"/>
+      <w:r>
+        <w:t>Student</w:t>
+      </w:r>
+      <w:proofErr w:type="spellEnd"/>
+      <w:r>
+        <w:t xml:space="preserve"> (2024) apresenta uma solução integrada, com funcionalidades relacionadas à gestão do histórico acadêmico, cadastro de estudantes e automação de processos institucionais. Essas soluções demonstram contribuições para a gestão educacional e evidenciam o potencial das tecnologias digitais nesse contexto. No entanto, identificam-se limitações quanto à adaptação a diferentes realidades institucionais e ao escopo de aplicação. Diante disso, verifica-se a necessidade de desenvolvimento de um sistema que atenda de forma mais específica às demandas da CAE</w:t>
       </w:r>
       <w:r>
         <w:t>.</w:t>
@@ -4539,11 +4881,8 @@
         <w:pStyle w:val="TF-TEXTO"/>
       </w:pPr>
       <w:r>
-        <w:t xml:space="preserve">Com base nas características apresentadas, o presente trabalho demonstra relevância ao propor uma solução direcionada às demandas da CAE, contribuindo para a organização e o </w:t>
-      </w:r>
-      <w:r>
         <w:lastRenderedPageBreak/>
-        <w:t xml:space="preserve">gerenciamento das informações acadêmicas e administrativas. No âmbito institucional, a proposta visa à otimização dos processos de atendimento e acompanhamento dos estudantes, promovendo maior eficiência e centralização dos dados. Sob a perspectiva tecnológica, o sistema é desenvolvido com a linguagem Python, utilizando o </w:t>
+        <w:t xml:space="preserve">Com base nas características apresentadas, o presente trabalho demonstra relevância ao propor uma solução direcionada às demandas da CAE, contribuindo para a organização e o gerenciamento das informações acadêmicas e administrativas. No âmbito institucional, a proposta visa à otimização dos processos de atendimento e acompanhamento dos estudantes, promovendo maior eficiência e centralização dos dados. Sob a perspectiva tecnológica, o sistema é desenvolvido com a linguagem Python, utilizando o </w:t>
       </w:r>
       <w:r>
         <w:rPr>
@@ -4650,17 +4989,14 @@
         <w:pStyle w:val="TF-ALNEA"/>
       </w:pPr>
       <w:r>
+        <w:lastRenderedPageBreak/>
         <w:t>e</w:t>
       </w:r>
       <w:r>
         <w:t xml:space="preserve">ntrevistas: </w:t>
       </w:r>
       <w:r>
-        <w:t xml:space="preserve">condução de entrevistas com a supervisora e demais usuários envolvidos, com o objetivo de compreender necessidades específicas e obter </w:t>
-      </w:r>
-      <w:r>
-        <w:lastRenderedPageBreak/>
-        <w:t>percepções relacionadas ao processo de gestão</w:t>
+        <w:t>condução de entrevistas com a supervisora e demais usuários envolvidos, com o objetivo de compreender necessidades específicas e obter percepções relacionadas ao processo de gestão</w:t>
       </w:r>
       <w:r>
         <w:t>;</w:t>
@@ -4698,7 +5034,15 @@
         <w:t xml:space="preserve">prototipagem: </w:t>
       </w:r>
       <w:r>
-        <w:t>desenvolvimento de protótipos de alta fidelidade por meio da ferramenta Figma, possibilitando a validação prévia das funcionalidades</w:t>
+        <w:t xml:space="preserve">desenvolvimento de protótipos de alta fidelidade por meio da ferramenta </w:t>
+      </w:r>
+      <w:proofErr w:type="spellStart"/>
+      <w:r>
+        <w:t>Figma</w:t>
+      </w:r>
+      <w:proofErr w:type="spellEnd"/>
+      <w:r>
+        <w:t>, possibilitando a validação prévia das funcionalidades</w:t>
       </w:r>
       <w:r>
         <w:t>;</w:t>
@@ -4786,7 +5130,31 @@
         <w:t xml:space="preserve">especificação e análise: </w:t>
       </w:r>
       <w:r>
-        <w:t xml:space="preserve">formalização das funcionalidades por meio de documentos como especificação de requisitos, casos de uso, matriz de rastreabilidade e diagramas da Unified Modeling Language (UML), </w:t>
+        <w:t xml:space="preserve">formalização das funcionalidades por meio de documentos como especificação de requisitos, casos de uso, matriz de rastreabilidade e diagramas da </w:t>
+      </w:r>
+      <w:proofErr w:type="spellStart"/>
+      <w:r>
+        <w:t>Unified</w:t>
+      </w:r>
+      <w:proofErr w:type="spellEnd"/>
+      <w:r>
+        <w:t xml:space="preserve"> </w:t>
+      </w:r>
+      <w:proofErr w:type="spellStart"/>
+      <w:r>
+        <w:t>Modeling</w:t>
+      </w:r>
+      <w:proofErr w:type="spellEnd"/>
+      <w:r>
+        <w:t xml:space="preserve"> </w:t>
+      </w:r>
+      <w:proofErr w:type="spellStart"/>
+      <w:r>
+        <w:t>Language</w:t>
+      </w:r>
+      <w:proofErr w:type="spellEnd"/>
+      <w:r>
+        <w:t xml:space="preserve"> (UML), </w:t>
       </w:r>
       <w:r>
         <w:t xml:space="preserve">como o Diagrama de Caso de Uso e do diagrama de implantação, </w:t>
@@ -4882,6 +5250,7 @@
       <w:r>
         <w:t xml:space="preserve">desenvolvimento com base nos requisitos definidos, considerando as necessidades identificadas junto à CAE. O </w:t>
       </w:r>
+      <w:proofErr w:type="spellStart"/>
       <w:r>
         <w:rPr>
           <w:i/>
@@ -4889,6 +5258,7 @@
         </w:rPr>
         <w:t>backend</w:t>
       </w:r>
+      <w:proofErr w:type="spellEnd"/>
       <w:r>
         <w:t xml:space="preserve"> será desenvolvido em Python, com o uso do </w:t>
       </w:r>
@@ -4922,11 +5292,33 @@
         </w:rPr>
         <w:t xml:space="preserve">frontend </w:t>
       </w:r>
-      <w:r>
-        <w:rPr>
-          <w:lang w:val="en-US"/>
-        </w:rPr>
-        <w:t xml:space="preserve">utilizará HyperText Markup Language (HTML), Cascading Style Sheets (CSS) e TypeScript, com o </w:t>
+      <w:proofErr w:type="spellStart"/>
+      <w:r>
+        <w:rPr>
+          <w:lang w:val="en-US"/>
+        </w:rPr>
+        <w:t>utilizará</w:t>
+      </w:r>
+      <w:proofErr w:type="spellEnd"/>
+      <w:r>
+        <w:rPr>
+          <w:lang w:val="en-US"/>
+        </w:rPr>
+        <w:t xml:space="preserve"> </w:t>
+      </w:r>
+      <w:proofErr w:type="spellStart"/>
+      <w:r>
+        <w:rPr>
+          <w:lang w:val="en-US"/>
+        </w:rPr>
+        <w:t>HyperText</w:t>
+      </w:r>
+      <w:proofErr w:type="spellEnd"/>
+      <w:r>
+        <w:rPr>
+          <w:lang w:val="en-US"/>
+        </w:rPr>
+        <w:t xml:space="preserve"> Markup Language (HTML), Cascading Style Sheets (CSS) e TypeScript, com o </w:t>
       </w:r>
       <w:r>
         <w:rPr>
@@ -4957,7 +5349,31 @@
         <w:t xml:space="preserve">automação de testes: </w:t>
       </w:r>
       <w:r>
-        <w:t>implementação de testes funcionais automatizados das funcionalidades e das interfaces desenvolvidas, com o uso da ferramenta Cypress e de práticas de Continuous Integration/Continuous Delivery (CI/CD), com o objetivo de assegurar a qualidade e a confiabilidade do sistema</w:t>
+        <w:t xml:space="preserve">implementação de testes funcionais automatizados das funcionalidades e das interfaces desenvolvidas, com o uso da ferramenta Cypress e de práticas de </w:t>
+      </w:r>
+      <w:proofErr w:type="spellStart"/>
+      <w:r>
+        <w:t>Continuous</w:t>
+      </w:r>
+      <w:proofErr w:type="spellEnd"/>
+      <w:r>
+        <w:t xml:space="preserve"> </w:t>
+      </w:r>
+      <w:proofErr w:type="spellStart"/>
+      <w:r>
+        <w:t>Integration</w:t>
+      </w:r>
+      <w:proofErr w:type="spellEnd"/>
+      <w:r>
+        <w:t>/</w:t>
+      </w:r>
+      <w:proofErr w:type="spellStart"/>
+      <w:r>
+        <w:t>Continuous</w:t>
+      </w:r>
+      <w:proofErr w:type="spellEnd"/>
+      <w:r>
+        <w:t xml:space="preserve"> Delivery (CI/CD), com o objetivo de assegurar a qualidade e a confiabilidade do sistema</w:t>
       </w:r>
       <w:r>
         <w:t>;</w:t>
@@ -5000,12 +5416,21 @@
       <w:r>
         <w:t xml:space="preserve"> P. </w:t>
       </w:r>
+      <w:proofErr w:type="spellStart"/>
       <w:r>
         <w:rPr>
           <w:b/>
           <w:bCs/>
         </w:rPr>
-        <w:t>EduMaster: um gerenciador de matrículas de alunos com deficiência para o controle e encaminhamento ao atendimento educacional especializado (AEE), nas escolas de nível fundamental</w:t>
+        <w:t>EduMaster</w:t>
+      </w:r>
+      <w:proofErr w:type="spellEnd"/>
+      <w:r>
+        <w:rPr>
+          <w:b/>
+          <w:bCs/>
+        </w:rPr>
+        <w:t>: um gerenciador de matrículas de alunos com deficiência para o controle e encaminhamento ao atendimento educacional especializado (AEE), nas escolas de nível fundamental</w:t>
       </w:r>
       <w:r>
         <w:t xml:space="preserve">. </w:t>
@@ -5084,7 +5509,15 @@
         <w:t>s. l.</w:t>
       </w:r>
       <w:r>
-        <w:t xml:space="preserve">], v. 11, n. 9, p. 3948–3957, 2025. DOI: 10.51891/rease.v11i9.21258. Disponível em: </w:t>
+        <w:t>], v. 11, n. 9, p. 3948–3957, 2025. DOI: 10.51891/</w:t>
+      </w:r>
+      <w:proofErr w:type="gramStart"/>
+      <w:r>
+        <w:t>rease.v</w:t>
+      </w:r>
+      <w:proofErr w:type="gramEnd"/>
+      <w:r>
+        <w:t xml:space="preserve">11i9.21258. Disponível em: </w:t>
       </w:r>
       <w:hyperlink r:id="rId12" w:history="1">
         <w:r>
@@ -5107,6 +5540,22 @@
         <w:pStyle w:val="TF-refernciasITEM"/>
       </w:pPr>
       <w:r>
+        <w:t xml:space="preserve">BORGES, L. V.; LUZ, G. </w:t>
+      </w:r>
+      <w:proofErr w:type="spellStart"/>
+      <w:r>
+        <w:t>da</w:t>
+      </w:r>
+      <w:proofErr w:type="spellEnd"/>
+      <w:r>
+        <w:t>; LOPES, A. L. L. Entrevista sobre gestão e processos administrativos no contexto da CAE. Entrevistadores: Eduardo Zirbell; Guilherme Kuhnen. Blumenau, mar. 2026.</w:t>
+      </w:r>
+    </w:p>
+    <w:p>
+      <w:pPr>
+        <w:pStyle w:val="TF-refernciasITEM"/>
+      </w:pPr>
+      <w:r>
         <w:t xml:space="preserve">CAMPOS, </w:t>
       </w:r>
       <w:r>
@@ -5207,13 +5656,76 @@
         <w:pStyle w:val="TF-refernciasITEM"/>
       </w:pPr>
       <w:r>
-        <w:t xml:space="preserve">COSTA, S. E. da </w:t>
+        <w:t>CAVALCANTE, G. M.; JUNIOR, J.</w:t>
+      </w:r>
+      <w:r>
+        <w:t xml:space="preserve"> I.</w:t>
+      </w:r>
+      <w:r>
+        <w:t xml:space="preserve">; CEOLIN, A. C. A influência dos sistemas integrados no gerenciamento do desempenho em instituições públicas. </w:t>
+      </w:r>
+      <w:proofErr w:type="spellStart"/>
+      <w:r>
+        <w:rPr>
+          <w:b/>
+          <w:bCs/>
+        </w:rPr>
+        <w:t>ABCustos</w:t>
+      </w:r>
+      <w:proofErr w:type="spellEnd"/>
+      <w:r>
+        <w:t>, [</w:t>
       </w:r>
       <w:r>
         <w:rPr>
           <w:i/>
           <w:iCs/>
         </w:rPr>
+        <w:t>s</w:t>
+      </w:r>
+      <w:r>
+        <w:rPr>
+          <w:i/>
+          <w:iCs/>
+        </w:rPr>
+        <w:t>. l.</w:t>
+      </w:r>
+      <w:r>
+        <w:t xml:space="preserve">], v. 15, n. 1, p. 89–114, 2020. DOI: https://doi.org/10.47179/abcustos.v15i1.543. Disponível em: </w:t>
+      </w:r>
+      <w:hyperlink r:id="rId14" w:tgtFrame="_new" w:history="1">
+        <w:r>
+          <w:rPr>
+            <w:rStyle w:val="Hyperlink"/>
+            <w:noProof w:val="0"/>
+          </w:rPr>
+          <w:t>https://revista.abcustos.org.br/abcustos/article/view/543</w:t>
+        </w:r>
+      </w:hyperlink>
+      <w:r>
+        <w:t>. Acesso em: 24 abr. 2026.</w:t>
+      </w:r>
+    </w:p>
+    <w:p>
+      <w:pPr>
+        <w:pStyle w:val="TF-refernciasITEM"/>
+      </w:pPr>
+      <w:r>
+        <w:t xml:space="preserve">COSTA, S. E. </w:t>
+      </w:r>
+      <w:proofErr w:type="spellStart"/>
+      <w:r>
+        <w:t>da</w:t>
+      </w:r>
+      <w:proofErr w:type="spellEnd"/>
+      <w:r>
+        <w:t xml:space="preserve"> </w:t>
+      </w:r>
+      <w:r>
+        <w:rPr>
+          <w:i/>
+          <w:iCs/>
+        </w:rPr>
         <w:t>et al</w:t>
       </w:r>
       <w:r>
@@ -5229,7 +5741,7 @@
       <w:r>
         <w:t xml:space="preserve"> [...]. Porto Alegre: Sociedade Brasileira de Computação, 2016. p. 1537-1548. DOI: https://doi.org/10.5753/sbsc.2016.9508. Disponível em: </w:t>
       </w:r>
-      <w:hyperlink r:id="rId14" w:history="1">
+      <w:hyperlink r:id="rId15" w:history="1">
         <w:r>
           <w:rPr>
             <w:rStyle w:val="Hyperlink"/>
@@ -5270,17 +5782,29 @@
       <w:r>
         <w:t xml:space="preserve">COSTA, S. E. da. </w:t>
       </w:r>
+      <w:proofErr w:type="spellStart"/>
       <w:r>
         <w:rPr>
           <w:b/>
           <w:bCs/>
         </w:rPr>
-        <w:t>iLibras como facilitador na comunicação efetiva do surdo: uso de tecnologia assistiva e colaborativa móvel</w:t>
-      </w:r>
-      <w:r>
-        <w:t xml:space="preserve">. 2018. 263 f. Dissertação (Mestrado em Computação Aplicada) - Programa de Pós-Graduação em Computação Aplicada, Universidade do Estado de Santa Catarina, Joinville, 2018. Disponível em: </w:t>
-      </w:r>
-      <w:hyperlink r:id="rId15" w:history="1">
+        <w:t>iLibras</w:t>
+      </w:r>
+      <w:proofErr w:type="spellEnd"/>
+      <w:r>
+        <w:rPr>
+          <w:b/>
+          <w:bCs/>
+        </w:rPr>
+        <w:t xml:space="preserve"> como facilitador na comunicação efetiva do surdo</w:t>
+      </w:r>
+      <w:r>
+        <w:t>: uso de tecnologia assistiva e colaborativa móvel.</w:t>
+      </w:r>
+      <w:r>
+        <w:t xml:space="preserve"> 2018. 263 f. Dissertação (Mestrado em Computação Aplicada) - Programa de Pós-Graduação em Computação Aplicada, Universidade do Estado de Santa Catarina, Joinville, 2018. Disponível em: </w:t>
+      </w:r>
+      <w:hyperlink r:id="rId16" w:history="1">
         <w:r>
           <w:rPr>
             <w:rStyle w:val="Hyperlink"/>
@@ -5331,7 +5855,15 @@
         <w:t>.</w:t>
       </w:r>
       <w:r>
-        <w:t xml:space="preserve"> da C</w:t>
+        <w:t xml:space="preserve"> </w:t>
+      </w:r>
+      <w:proofErr w:type="spellStart"/>
+      <w:r>
+        <w:t>da</w:t>
+      </w:r>
+      <w:proofErr w:type="spellEnd"/>
+      <w:r>
+        <w:t xml:space="preserve"> C</w:t>
       </w:r>
       <w:r>
         <w:t>.</w:t>
@@ -5344,30 +5876,33 @@
           <w:b/>
           <w:bCs/>
         </w:rPr>
-        <w:t>Vantagens e desafios do uso de sistemas integrados de gestão (ERP) por pequenas e médias empresas no Brasil: uma revisão de literatura</w:t>
+        <w:t>Vantagens e desafios do uso de sistemas integrados de gestão (ERP) por pequenas e médias empresas no Brasil</w:t>
+      </w:r>
+      <w:r>
+        <w:t>: uma revisão de literatura.</w:t>
+      </w:r>
+      <w:r>
+        <w:t xml:space="preserve"> </w:t>
+      </w:r>
+      <w:r>
+        <w:t>Orientador:</w:t>
+      </w:r>
+      <w:r>
+        <w:t xml:space="preserve"> Paulo Cesar Leite</w:t>
+      </w:r>
+      <w:r>
+        <w:t xml:space="preserve"> </w:t>
+      </w:r>
+      <w:r>
+        <w:t>Esteves</w:t>
       </w:r>
       <w:r>
         <w:t xml:space="preserve">. </w:t>
       </w:r>
       <w:r>
-        <w:t>Orientador:</w:t>
-      </w:r>
-      <w:r>
-        <w:t xml:space="preserve"> Paulo Cesar Leite</w:t>
-      </w:r>
-      <w:r>
-        <w:t xml:space="preserve"> </w:t>
-      </w:r>
-      <w:r>
-        <w:t>Esteves</w:t>
-      </w:r>
-      <w:r>
-        <w:t xml:space="preserve">. </w:t>
-      </w:r>
-      <w:r>
         <w:t xml:space="preserve">2022. 32 f. Trabalho de Conclusão de Curso (Graduação em Tecnologias da Informação e Comunicação) – Universidade Federal de Santa Catarina, Campus Araranguá, Araranguá, 2022. Disponível em: </w:t>
       </w:r>
-      <w:hyperlink r:id="rId16" w:history="1">
+      <w:hyperlink r:id="rId17" w:history="1">
         <w:r>
           <w:rPr>
             <w:rStyle w:val="Hyperlink"/>
@@ -5429,7 +5964,7 @@
       <w:r>
         <w:t xml:space="preserve">. Disponível em: </w:t>
       </w:r>
-      <w:hyperlink r:id="rId17" w:tgtFrame="_new" w:history="1">
+      <w:hyperlink r:id="rId18" w:tgtFrame="_new" w:history="1">
         <w:r>
           <w:rPr>
             <w:rStyle w:val="Hyperlink"/>
@@ -5489,6 +6024,7 @@
       <w:r>
         <w:t xml:space="preserve">], </w:t>
       </w:r>
+      <w:proofErr w:type="gramStart"/>
       <w:r>
         <w:t>202</w:t>
       </w:r>
@@ -5496,9 +6032,13 @@
         <w:t>?</w:t>
       </w:r>
       <w:r>
-        <w:t xml:space="preserve">. Disponível em: </w:t>
-      </w:r>
-      <w:hyperlink r:id="rId18" w:tgtFrame="_new" w:history="1">
+        <w:t>.</w:t>
+      </w:r>
+      <w:proofErr w:type="gramEnd"/>
+      <w:r>
+        <w:t xml:space="preserve"> Disponível em: </w:t>
+      </w:r>
+      <w:hyperlink r:id="rId19" w:tgtFrame="_new" w:history="1">
         <w:r>
           <w:rPr>
             <w:rStyle w:val="Hyperlink"/>
@@ -5522,8 +6062,10 @@
         <w:pStyle w:val="TF-refernciasITEM"/>
       </w:pPr>
       <w:r>
+        <w:lastRenderedPageBreak/>
         <w:t xml:space="preserve">GUIMARÃES, C. Design systems: 6 vantagens principais. </w:t>
       </w:r>
+      <w:proofErr w:type="spellStart"/>
       <w:r>
         <w:rPr>
           <w:b/>
@@ -5531,6 +6073,7 @@
         </w:rPr>
         <w:t>Medium</w:t>
       </w:r>
+      <w:proofErr w:type="spellEnd"/>
       <w:r>
         <w:t>, [</w:t>
       </w:r>
@@ -5544,7 +6087,7 @@
       <w:r>
         <w:t xml:space="preserve">], 2021. Disponível em: </w:t>
       </w:r>
-      <w:hyperlink r:id="rId19" w:tgtFrame="_new" w:history="1">
+      <w:hyperlink r:id="rId20" w:tgtFrame="_new" w:history="1">
         <w:r>
           <w:rPr>
             <w:rStyle w:val="Hyperlink"/>
@@ -5591,9 +6134,17 @@
         <w:t>s. l.</w:t>
       </w:r>
       <w:r>
-        <w:t xml:space="preserve">], v. 15, n. 4, p. e3672, 2024. DOI: 10.7769/gesec.v15i4.3672. Disponível em: </w:t>
-      </w:r>
-      <w:hyperlink r:id="rId20" w:history="1">
+        <w:t>], v. 15, n. 4, p. e3672, 2024. DOI: 10.7769/</w:t>
+      </w:r>
+      <w:proofErr w:type="gramStart"/>
+      <w:r>
+        <w:t>gesec.v</w:t>
+      </w:r>
+      <w:proofErr w:type="gramEnd"/>
+      <w:r>
+        <w:t xml:space="preserve">15i4.3672. Disponível em: </w:t>
+      </w:r>
+      <w:hyperlink r:id="rId21" w:history="1">
         <w:r>
           <w:rPr>
             <w:rStyle w:val="Hyperlink"/>
@@ -5605,11 +6156,33 @@
       <w:r>
         <w:t xml:space="preserve">. </w:t>
       </w:r>
-      <w:r>
-        <w:rPr>
-          <w:lang w:val="en-US"/>
-        </w:rPr>
-        <w:t>Acesso em: 10 abr. 2026.</w:t>
+      <w:proofErr w:type="spellStart"/>
+      <w:r>
+        <w:rPr>
+          <w:lang w:val="en-US"/>
+        </w:rPr>
+        <w:t>Acesso</w:t>
+      </w:r>
+      <w:proofErr w:type="spellEnd"/>
+      <w:r>
+        <w:rPr>
+          <w:lang w:val="en-US"/>
+        </w:rPr>
+        <w:t xml:space="preserve"> </w:t>
+      </w:r>
+      <w:proofErr w:type="spellStart"/>
+      <w:r>
+        <w:rPr>
+          <w:lang w:val="en-US"/>
+        </w:rPr>
+        <w:t>em</w:t>
+      </w:r>
+      <w:proofErr w:type="spellEnd"/>
+      <w:r>
+        <w:rPr>
+          <w:lang w:val="en-US"/>
+        </w:rPr>
+        <w:t>: 10 abr. 2026.</w:t>
       </w:r>
     </w:p>
     <w:p>
@@ -5623,7 +6196,6 @@
         <w:rPr>
           <w:lang w:val="en-US"/>
         </w:rPr>
-        <w:lastRenderedPageBreak/>
         <w:t>KROENKE, D</w:t>
       </w:r>
       <w:r>
@@ -5716,6 +6288,9 @@
     <w:p>
       <w:pPr>
         <w:pStyle w:val="TF-refernciasITEM"/>
+        <w:rPr>
+          <w:lang w:val="en-US"/>
+        </w:rPr>
       </w:pPr>
       <w:r>
         <w:t xml:space="preserve">LAUDON, </w:t>
@@ -5746,23 +6321,66 @@
         <w:t xml:space="preserve">. </w:t>
       </w:r>
       <w:r>
+        <w:rPr>
+          <w:lang w:val="en-US"/>
+        </w:rPr>
         <w:t>17. ed. Porto Alegre: Bookman, 2022.</w:t>
       </w:r>
     </w:p>
     <w:p>
       <w:pPr>
         <w:pStyle w:val="TF-refernciasITEM"/>
-        <w:rPr>
-          <w:lang w:val="en-US"/>
-        </w:rPr>
-      </w:pPr>
-      <w:r>
-        <w:t xml:space="preserve">MATIUZZO, I. Entendendo a WCAG. </w:t>
+      </w:pPr>
+      <w:r>
+        <w:rPr>
+          <w:lang w:val="en-US"/>
+        </w:rPr>
+        <w:t xml:space="preserve">Microsoft. </w:t>
       </w:r>
       <w:r>
         <w:rPr>
           <w:b/>
           <w:bCs/>
+          <w:lang w:val="en-US"/>
+        </w:rPr>
+        <w:t>What is ERP? Enterprise resource planning explained</w:t>
+      </w:r>
+      <w:r>
+        <w:rPr>
+          <w:lang w:val="en-US"/>
+        </w:rPr>
+        <w:t xml:space="preserve">. </w:t>
+      </w:r>
+      <w:r>
+        <w:t xml:space="preserve">Microsoft, 2023. Disponível em: </w:t>
+      </w:r>
+      <w:hyperlink r:id="rId22" w:tgtFrame="_new" w:history="1">
+        <w:r>
+          <w:rPr>
+            <w:rStyle w:val="Hyperlink"/>
+            <w:noProof w:val="0"/>
+          </w:rPr>
+          <w:t>https://dynamics.microsoft.com/en-us/erp/what-is-erp/</w:t>
+        </w:r>
+      </w:hyperlink>
+      <w:r>
+        <w:t>. Acesso em: 9 abr. 2026.</w:t>
+      </w:r>
+    </w:p>
+    <w:p>
+      <w:pPr>
+        <w:pStyle w:val="TF-refernciasITEM"/>
+        <w:rPr>
+          <w:lang w:val="en-US"/>
+        </w:rPr>
+      </w:pPr>
+      <w:r>
+        <w:t xml:space="preserve">MATIUZZO, I. Entendendo a WCAG. </w:t>
+      </w:r>
+      <w:r>
+        <w:rPr>
+          <w:b/>
+          <w:bCs/>
         </w:rPr>
         <w:t>UX Collective Brasil</w:t>
       </w:r>
@@ -5779,7 +6397,7 @@
       <w:r>
         <w:t xml:space="preserve">], 2024. Disponível em: </w:t>
       </w:r>
-      <w:hyperlink r:id="rId21" w:tgtFrame="_new" w:history="1">
+      <w:hyperlink r:id="rId23" w:tgtFrame="_new" w:history="1">
         <w:r>
           <w:rPr>
             <w:rStyle w:val="Hyperlink"/>
@@ -5791,22 +6409,44 @@
       <w:r>
         <w:t xml:space="preserve">. </w:t>
       </w:r>
-      <w:r>
-        <w:rPr>
-          <w:lang w:val="en-US"/>
-        </w:rPr>
-        <w:t>Acesso em: 15 abr. 2026.</w:t>
+      <w:proofErr w:type="spellStart"/>
+      <w:r>
+        <w:rPr>
+          <w:lang w:val="en-US"/>
+        </w:rPr>
+        <w:t>Acesso</w:t>
+      </w:r>
+      <w:proofErr w:type="spellEnd"/>
+      <w:r>
+        <w:rPr>
+          <w:lang w:val="en-US"/>
+        </w:rPr>
+        <w:t xml:space="preserve"> </w:t>
+      </w:r>
+      <w:proofErr w:type="spellStart"/>
+      <w:r>
+        <w:rPr>
+          <w:lang w:val="en-US"/>
+        </w:rPr>
+        <w:t>em</w:t>
+      </w:r>
+      <w:proofErr w:type="spellEnd"/>
+      <w:r>
+        <w:rPr>
+          <w:lang w:val="en-US"/>
+        </w:rPr>
+        <w:t>: 15 abr. 2026.</w:t>
       </w:r>
     </w:p>
     <w:p>
       <w:pPr>
         <w:pStyle w:val="TF-refernciasITEM"/>
-      </w:pPr>
-      <w:r>
-        <w:rPr>
-          <w:lang w:val="en-US"/>
-        </w:rPr>
-        <w:t xml:space="preserve">NIELSEN, J. 10 usability heuristics for user interface design. </w:t>
+        <w:rPr>
+          <w:lang w:val="en-US"/>
+        </w:rPr>
+      </w:pPr>
+      <w:r>
+        <w:t xml:space="preserve">NEVES, J. M. S.; AZEVEDO, M. M.; LÉLIS, E. C. Benefícios e dificuldades na integração de sistemas de gestão: um estudo em empresas do Vale do Paraíba. </w:t>
       </w:r>
       <w:r>
         <w:rPr>
@@ -5814,6 +6454,80 @@
           <w:bCs/>
           <w:lang w:val="en-US"/>
         </w:rPr>
+        <w:t>South American Development Society Journal</w:t>
+      </w:r>
+      <w:r>
+        <w:rPr>
+          <w:lang w:val="en-US"/>
+        </w:rPr>
+        <w:t>, [</w:t>
+      </w:r>
+      <w:r>
+        <w:rPr>
+          <w:i/>
+          <w:iCs/>
+          <w:lang w:val="en-US"/>
+        </w:rPr>
+        <w:t>s</w:t>
+      </w:r>
+      <w:r>
+        <w:rPr>
+          <w:i/>
+          <w:iCs/>
+          <w:lang w:val="en-US"/>
+        </w:rPr>
+        <w:t>. l.</w:t>
+      </w:r>
+      <w:r>
+        <w:rPr>
+          <w:lang w:val="en-US"/>
+        </w:rPr>
+        <w:t xml:space="preserve">], v. 10, n. 28, p. 90–107, 2024. </w:t>
+      </w:r>
+      <w:r>
+        <w:t xml:space="preserve">DOI: </w:t>
+      </w:r>
+      <w:hyperlink r:id="rId24" w:tgtFrame="_new" w:history="1">
+        <w:r>
+          <w:rPr>
+            <w:rStyle w:val="Hyperlink"/>
+            <w:noProof w:val="0"/>
+          </w:rPr>
+          <w:t>https://doi.org/10.24325/issn.2446-5763.v10i28p90-107</w:t>
+        </w:r>
+      </w:hyperlink>
+      <w:r>
+        <w:t xml:space="preserve">. Disponível em: </w:t>
+      </w:r>
+      <w:hyperlink r:id="rId25" w:tgtFrame="_new" w:history="1">
+        <w:r>
+          <w:rPr>
+            <w:rStyle w:val="Hyperlink"/>
+            <w:noProof w:val="0"/>
+          </w:rPr>
+          <w:t>https://sadsj.org/index.php/revista/article/view/694</w:t>
+        </w:r>
+      </w:hyperlink>
+      <w:r>
+        <w:t>. Acesso em: 24 abr. 2026.</w:t>
+      </w:r>
+    </w:p>
+    <w:p>
+      <w:pPr>
+        <w:pStyle w:val="TF-refernciasITEM"/>
+      </w:pPr>
+      <w:r>
+        <w:rPr>
+          <w:lang w:val="en-US"/>
+        </w:rPr>
+        <w:t xml:space="preserve">NIELSEN, J. 10 usability heuristics for user interface design. </w:t>
+      </w:r>
+      <w:r>
+        <w:rPr>
+          <w:b/>
+          <w:bCs/>
+          <w:lang w:val="en-US"/>
+        </w:rPr>
         <w:t>Nielsen Norman Group</w:t>
       </w:r>
       <w:r>
@@ -5825,7 +6539,7 @@
       <w:r>
         <w:t xml:space="preserve">Disponível em: </w:t>
       </w:r>
-      <w:hyperlink r:id="rId22" w:history="1">
+      <w:hyperlink r:id="rId26" w:history="1">
         <w:r>
           <w:rPr>
             <w:rStyle w:val="Hyperlink"/>
@@ -5909,7 +6623,7 @@
       <w:r>
         <w:t xml:space="preserve">. DOI: 10.28998/rpss.v10iEspecial.19752. Disponível em: </w:t>
       </w:r>
-      <w:hyperlink r:id="rId23" w:history="1">
+      <w:hyperlink r:id="rId27" w:history="1">
         <w:r>
           <w:rPr>
             <w:rStyle w:val="Hyperlink"/>
@@ -5921,11 +6635,33 @@
       <w:r>
         <w:t xml:space="preserve">. </w:t>
       </w:r>
-      <w:r>
-        <w:rPr>
-          <w:lang w:val="en-US"/>
-        </w:rPr>
-        <w:t>Acesso em: 15 abr. 2026.</w:t>
+      <w:proofErr w:type="spellStart"/>
+      <w:r>
+        <w:rPr>
+          <w:lang w:val="en-US"/>
+        </w:rPr>
+        <w:t>Acesso</w:t>
+      </w:r>
+      <w:proofErr w:type="spellEnd"/>
+      <w:r>
+        <w:rPr>
+          <w:lang w:val="en-US"/>
+        </w:rPr>
+        <w:t xml:space="preserve"> </w:t>
+      </w:r>
+      <w:proofErr w:type="spellStart"/>
+      <w:r>
+        <w:rPr>
+          <w:lang w:val="en-US"/>
+        </w:rPr>
+        <w:t>em</w:t>
+      </w:r>
+      <w:proofErr w:type="spellEnd"/>
+      <w:r>
+        <w:rPr>
+          <w:lang w:val="en-US"/>
+        </w:rPr>
+        <w:t>: 15 abr. 2026.</w:t>
       </w:r>
     </w:p>
     <w:p>
@@ -5953,9 +6689,17 @@
         <w:t xml:space="preserve">. </w:t>
       </w:r>
       <w:r>
-        <w:t xml:space="preserve">Paris: OECD Publishing, 2023. DOI: </w:t>
-      </w:r>
-      <w:hyperlink r:id="rId24" w:tgtFrame="_new" w:history="1">
+        <w:t xml:space="preserve">Paris: OECD </w:t>
+      </w:r>
+      <w:proofErr w:type="spellStart"/>
+      <w:r>
+        <w:t>Publishing</w:t>
+      </w:r>
+      <w:proofErr w:type="spellEnd"/>
+      <w:r>
+        <w:t xml:space="preserve">, 2023. DOI: </w:t>
+      </w:r>
+      <w:hyperlink r:id="rId28" w:tgtFrame="_new" w:history="1">
         <w:r>
           <w:rPr>
             <w:rStyle w:val="Hyperlink"/>
@@ -5967,7 +6711,7 @@
       <w:r>
         <w:t xml:space="preserve">. Disponível em: </w:t>
       </w:r>
-      <w:hyperlink r:id="rId25" w:tgtFrame="_new" w:history="1">
+      <w:hyperlink r:id="rId29" w:tgtFrame="_new" w:history="1">
         <w:r>
           <w:rPr>
             <w:rStyle w:val="Hyperlink"/>
@@ -6021,7 +6765,7 @@
       <w:r>
         <w:t xml:space="preserve">, Rio de Janeiro, v. 3, n. 26, p. 1–12, 2025. Disponível em: </w:t>
       </w:r>
-      <w:hyperlink r:id="rId26" w:history="1">
+      <w:hyperlink r:id="rId30" w:history="1">
         <w:r>
           <w:rPr>
             <w:rStyle w:val="Hyperlink"/>
@@ -6043,48 +6787,78 @@
     <w:p>
       <w:pPr>
         <w:pStyle w:val="TF-refernciasITEM"/>
-        <w:rPr>
-          <w:lang w:val="en-US"/>
-        </w:rPr>
-      </w:pPr>
-      <w:r>
-        <w:t xml:space="preserve">OLIVEIRA, </w:t>
-      </w:r>
-      <w:r>
-        <w:t>K. C.</w:t>
-      </w:r>
-      <w:r>
-        <w:t>; PEREIRA, B</w:t>
-      </w:r>
-      <w:r>
-        <w:t>.</w:t>
-      </w:r>
-      <w:r>
-        <w:t xml:space="preserve"> A</w:t>
-      </w:r>
-      <w:r>
-        <w:t>.</w:t>
-      </w:r>
-      <w:r>
-        <w:t xml:space="preserve">; DAMIÃO, </w:t>
-      </w:r>
-      <w:r>
-        <w:t xml:space="preserve">D. L. </w:t>
-      </w:r>
-      <w:r>
-        <w:t xml:space="preserve">N. </w:t>
-      </w:r>
-      <w:r>
-        <w:t>Função do enfermeiro diante da análise de prontuários: Principais dificuldades enfrentadas</w:t>
-      </w:r>
-      <w:r>
-        <w:t xml:space="preserve">. </w:t>
+      </w:pPr>
+      <w:r>
+        <w:t xml:space="preserve">OLIVEIRA, D. B. de; CARVALHAES, J. D. </w:t>
       </w:r>
       <w:r>
         <w:rPr>
           <w:b/>
           <w:bCs/>
         </w:rPr>
+        <w:t>Sistemas de informação integrados à gestão de estoque</w:t>
+      </w:r>
+      <w:r>
+        <w:t xml:space="preserve">. Orientador: Maria Cristina Aranda. 2020. Trabalho de Conclusão de Curso (Curso Superior de Tecnologia em Logística) – Faculdade de Tecnologia de Americana, Americana, 2020. Disponível em: </w:t>
+      </w:r>
+      <w:hyperlink r:id="rId31" w:tgtFrame="_new" w:history="1">
+        <w:r>
+          <w:rPr>
+            <w:rStyle w:val="Hyperlink"/>
+            <w:noProof w:val="0"/>
+          </w:rPr>
+          <w:t>http://ric-cps.eastus2.cloudapp.azure.com/handle/123456789/6833</w:t>
+        </w:r>
+      </w:hyperlink>
+      <w:r>
+        <w:t>. Acesso em: 24 abr. 2026.</w:t>
+      </w:r>
+    </w:p>
+    <w:p>
+      <w:pPr>
+        <w:pStyle w:val="TF-refernciasITEM"/>
+        <w:rPr>
+          <w:lang w:val="en-US"/>
+        </w:rPr>
+      </w:pPr>
+      <w:r>
+        <w:t xml:space="preserve">OLIVEIRA, </w:t>
+      </w:r>
+      <w:r>
+        <w:t>K. C.</w:t>
+      </w:r>
+      <w:r>
+        <w:t>; PEREIRA, B</w:t>
+      </w:r>
+      <w:r>
+        <w:t>.</w:t>
+      </w:r>
+      <w:r>
+        <w:t xml:space="preserve"> A</w:t>
+      </w:r>
+      <w:r>
+        <w:t>.</w:t>
+      </w:r>
+      <w:r>
+        <w:t xml:space="preserve">; DAMIÃO, </w:t>
+      </w:r>
+      <w:r>
+        <w:t xml:space="preserve">D. L. </w:t>
+      </w:r>
+      <w:r>
+        <w:t xml:space="preserve">N. </w:t>
+      </w:r>
+      <w:r>
+        <w:t>Função do enfermeiro diante da análise de prontuários: Principais dificuldades enfrentadas</w:t>
+      </w:r>
+      <w:r>
+        <w:t xml:space="preserve">. </w:t>
+      </w:r>
+      <w:r>
+        <w:rPr>
+          <w:b/>
+          <w:bCs/>
+        </w:rPr>
         <w:t>Revista de Geopolítica</w:t>
       </w:r>
       <w:r>
@@ -6107,7 +6881,7 @@
       <w:r>
         <w:t xml:space="preserve">], v. 16, n. 5, p. e990, 2025. DOI: 10.56238/revgeov16n5-165. Disponível em: </w:t>
       </w:r>
-      <w:hyperlink r:id="rId27" w:history="1">
+      <w:hyperlink r:id="rId32" w:history="1">
         <w:r>
           <w:rPr>
             <w:rStyle w:val="Hyperlink"/>
@@ -6119,11 +6893,33 @@
       <w:r>
         <w:t xml:space="preserve">. </w:t>
       </w:r>
-      <w:r>
-        <w:rPr>
-          <w:lang w:val="en-US"/>
-        </w:rPr>
-        <w:t xml:space="preserve">Acesso em: </w:t>
+      <w:proofErr w:type="spellStart"/>
+      <w:r>
+        <w:rPr>
+          <w:lang w:val="en-US"/>
+        </w:rPr>
+        <w:t>Acesso</w:t>
+      </w:r>
+      <w:proofErr w:type="spellEnd"/>
+      <w:r>
+        <w:rPr>
+          <w:lang w:val="en-US"/>
+        </w:rPr>
+        <w:t xml:space="preserve"> </w:t>
+      </w:r>
+      <w:proofErr w:type="spellStart"/>
+      <w:r>
+        <w:rPr>
+          <w:lang w:val="en-US"/>
+        </w:rPr>
+        <w:t>em</w:t>
+      </w:r>
+      <w:proofErr w:type="spellEnd"/>
+      <w:r>
+        <w:rPr>
+          <w:lang w:val="en-US"/>
+        </w:rPr>
+        <w:t xml:space="preserve">: </w:t>
       </w:r>
       <w:r>
         <w:rPr>
@@ -6141,15 +6937,12 @@
     <w:p>
       <w:pPr>
         <w:pStyle w:val="TF-refernciasITEM"/>
-        <w:rPr>
-          <w:lang w:val="en-US"/>
-        </w:rPr>
-      </w:pPr>
-      <w:r>
-        <w:rPr>
-          <w:lang w:val="en-US"/>
-        </w:rPr>
-        <w:t>PABLOS, F. D. A. Y.;</w:t>
+      </w:pPr>
+      <w:r>
+        <w:rPr>
+          <w:lang w:val="en-US"/>
+        </w:rPr>
+        <w:t xml:space="preserve">Oracle. </w:t>
       </w:r>
       <w:r>
         <w:rPr>
@@ -6157,20 +6950,80 @@
           <w:bCs/>
           <w:lang w:val="en-US"/>
         </w:rPr>
-        <w:t xml:space="preserve"> </w:t>
-      </w:r>
-      <w:r>
-        <w:rPr>
-          <w:lang w:val="en-US"/>
-        </w:rPr>
-        <w:t xml:space="preserve">FEITOSA, M. D. Accessibility in agile methods: a systematic literature review. </w:t>
-      </w:r>
+        <w:t>What is ERP (Enterprise Resource Planning</w:t>
+      </w:r>
+      <w:proofErr w:type="gramStart"/>
       <w:r>
         <w:rPr>
           <w:b/>
           <w:bCs/>
           <w:lang w:val="en-US"/>
         </w:rPr>
+        <w:t>)?</w:t>
+      </w:r>
+      <w:r>
+        <w:rPr>
+          <w:lang w:val="en-US"/>
+        </w:rPr>
+        <w:t>.</w:t>
+      </w:r>
+      <w:proofErr w:type="gramEnd"/>
+      <w:r>
+        <w:rPr>
+          <w:lang w:val="en-US"/>
+        </w:rPr>
+        <w:t xml:space="preserve"> </w:t>
+      </w:r>
+      <w:r>
+        <w:t xml:space="preserve">Oracle, 2022. Disponível em: </w:t>
+      </w:r>
+      <w:hyperlink r:id="rId33" w:tgtFrame="_new" w:history="1">
+        <w:r>
+          <w:rPr>
+            <w:rStyle w:val="Hyperlink"/>
+            <w:noProof w:val="0"/>
+          </w:rPr>
+          <w:t>https://www.oracle.com/erp/what-is-erp/</w:t>
+        </w:r>
+      </w:hyperlink>
+      <w:r>
+        <w:t>. Acesso em: 9 abr. 2026.</w:t>
+      </w:r>
+    </w:p>
+    <w:p>
+      <w:pPr>
+        <w:pStyle w:val="TF-refernciasITEM"/>
+        <w:rPr>
+          <w:lang w:val="en-US"/>
+        </w:rPr>
+      </w:pPr>
+      <w:r>
+        <w:rPr>
+          <w:lang w:val="en-US"/>
+        </w:rPr>
+        <w:lastRenderedPageBreak/>
+        <w:t>PABLOS, F. D. A. Y.;</w:t>
+      </w:r>
+      <w:r>
+        <w:rPr>
+          <w:b/>
+          <w:bCs/>
+          <w:lang w:val="en-US"/>
+        </w:rPr>
+        <w:t xml:space="preserve"> </w:t>
+      </w:r>
+      <w:r>
+        <w:rPr>
+          <w:lang w:val="en-US"/>
+        </w:rPr>
+        <w:t xml:space="preserve">FEITOSA, M. D. Accessibility in agile methods: a systematic literature review. </w:t>
+      </w:r>
+      <w:r>
+        <w:rPr>
+          <w:b/>
+          <w:bCs/>
+          <w:lang w:val="en-US"/>
+        </w:rPr>
         <w:t>Research, Society and Development</w:t>
       </w:r>
       <w:r>
@@ -6196,7 +7049,7 @@
       <w:r>
         <w:t xml:space="preserve">DOI: </w:t>
       </w:r>
-      <w:hyperlink r:id="rId28" w:tgtFrame="_new" w:history="1">
+      <w:hyperlink r:id="rId34" w:tgtFrame="_new" w:history="1">
         <w:r>
           <w:rPr>
             <w:rStyle w:val="Hyperlink"/>
@@ -6214,7 +7067,7 @@
       <w:r>
         <w:t xml:space="preserve"> </w:t>
       </w:r>
-      <w:hyperlink r:id="rId29" w:history="1">
+      <w:hyperlink r:id="rId35" w:history="1">
         <w:r>
           <w:rPr>
             <w:rStyle w:val="Hyperlink"/>
@@ -6226,11 +7079,33 @@
       <w:r>
         <w:t xml:space="preserve">. </w:t>
       </w:r>
-      <w:r>
-        <w:rPr>
-          <w:lang w:val="en-US"/>
-        </w:rPr>
-        <w:t>Acesso em: 15 abr. 2026.</w:t>
+      <w:proofErr w:type="spellStart"/>
+      <w:r>
+        <w:rPr>
+          <w:lang w:val="en-US"/>
+        </w:rPr>
+        <w:t>Acesso</w:t>
+      </w:r>
+      <w:proofErr w:type="spellEnd"/>
+      <w:r>
+        <w:rPr>
+          <w:lang w:val="en-US"/>
+        </w:rPr>
+        <w:t xml:space="preserve"> </w:t>
+      </w:r>
+      <w:proofErr w:type="spellStart"/>
+      <w:r>
+        <w:rPr>
+          <w:lang w:val="en-US"/>
+        </w:rPr>
+        <w:t>em</w:t>
+      </w:r>
+      <w:proofErr w:type="spellEnd"/>
+      <w:r>
+        <w:rPr>
+          <w:lang w:val="en-US"/>
+        </w:rPr>
+        <w:t>: 15 abr. 2026.</w:t>
       </w:r>
     </w:p>
     <w:p>
@@ -6312,6 +7187,9 @@
     <w:p>
       <w:pPr>
         <w:pStyle w:val="TF-refernciasITEM"/>
+        <w:rPr>
+          <w:lang w:val="en-US"/>
+        </w:rPr>
       </w:pPr>
       <w:r>
         <w:t xml:space="preserve">ROCHA, </w:t>
@@ -6342,9 +7220,17 @@
         <w:t>Revista Interface Tecnológica</w:t>
       </w:r>
       <w:r>
-        <w:t xml:space="preserve">, Taquaritinga, v. 21, n. 1, p. 447–458, 2025. DOI: 10.31510/infa.v21i1.1938. Disponível em: </w:t>
-      </w:r>
-      <w:hyperlink r:id="rId30" w:history="1">
+        <w:t>, Taquaritinga, v. 21, n. 1, p. 447–458, 2025. DOI: 10.31510/</w:t>
+      </w:r>
+      <w:proofErr w:type="gramStart"/>
+      <w:r>
+        <w:t>infa.v</w:t>
+      </w:r>
+      <w:proofErr w:type="gramEnd"/>
+      <w:r>
+        <w:t xml:space="preserve">21i1.1938. Disponível em: </w:t>
+      </w:r>
+      <w:hyperlink r:id="rId36" w:history="1">
         <w:r>
           <w:rPr>
             <w:rStyle w:val="Hyperlink"/>
@@ -6354,12 +7240,46 @@
         </w:r>
       </w:hyperlink>
       <w:r>
-        <w:t xml:space="preserve">. Acesso em: </w:t>
-      </w:r>
-      <w:r>
+        <w:t xml:space="preserve">. </w:t>
+      </w:r>
+      <w:proofErr w:type="spellStart"/>
+      <w:r>
+        <w:rPr>
+          <w:lang w:val="en-US"/>
+        </w:rPr>
+        <w:t>Acesso</w:t>
+      </w:r>
+      <w:proofErr w:type="spellEnd"/>
+      <w:r>
+        <w:rPr>
+          <w:lang w:val="en-US"/>
+        </w:rPr>
+        <w:t xml:space="preserve"> </w:t>
+      </w:r>
+      <w:proofErr w:type="spellStart"/>
+      <w:r>
+        <w:rPr>
+          <w:lang w:val="en-US"/>
+        </w:rPr>
+        <w:t>em</w:t>
+      </w:r>
+      <w:proofErr w:type="spellEnd"/>
+      <w:r>
+        <w:rPr>
+          <w:lang w:val="en-US"/>
+        </w:rPr>
+        <w:t xml:space="preserve">: </w:t>
+      </w:r>
+      <w:r>
+        <w:rPr>
+          <w:lang w:val="en-US"/>
+        </w:rPr>
         <w:t>15</w:t>
       </w:r>
       <w:r>
+        <w:rPr>
+          <w:lang w:val="en-US"/>
+        </w:rPr>
         <w:t xml:space="preserve"> abr. 2026.</w:t>
       </w:r>
     </w:p>
@@ -6371,32 +7291,70 @@
         <w:rPr>
           <w:lang w:val="en-US"/>
         </w:rPr>
-        <w:t xml:space="preserve">SABILANO, J. What are WCAG 2.0 A, AA, and AAA?. </w:t>
-      </w:r>
+        <w:t xml:space="preserve">SABILANO, J. What are WCAG 2.0 A, AA, and </w:t>
+      </w:r>
+      <w:proofErr w:type="gramStart"/>
+      <w:r>
+        <w:rPr>
+          <w:lang w:val="en-US"/>
+        </w:rPr>
+        <w:t>AAA?.</w:t>
+      </w:r>
+      <w:proofErr w:type="gramEnd"/>
+      <w:r>
+        <w:rPr>
+          <w:lang w:val="en-US"/>
+        </w:rPr>
+        <w:t xml:space="preserve"> </w:t>
+      </w:r>
+      <w:proofErr w:type="spellStart"/>
       <w:r>
         <w:rPr>
           <w:b/>
           <w:bCs/>
+          <w:lang w:val="en-US"/>
         </w:rPr>
         <w:t>UserWay</w:t>
       </w:r>
-      <w:r>
+      <w:proofErr w:type="spellEnd"/>
+      <w:r>
+        <w:rPr>
+          <w:lang w:val="en-US"/>
+        </w:rPr>
         <w:t>, [</w:t>
       </w:r>
       <w:r>
         <w:rPr>
           <w:i/>
           <w:iCs/>
+          <w:lang w:val="en-US"/>
         </w:rPr>
         <w:t>s. l.</w:t>
       </w:r>
       <w:r>
-        <w:t xml:space="preserve">], 202?. </w:t>
+        <w:rPr>
+          <w:lang w:val="en-US"/>
+        </w:rPr>
+        <w:t xml:space="preserve">], </w:t>
+      </w:r>
+      <w:proofErr w:type="gramStart"/>
+      <w:r>
+        <w:rPr>
+          <w:lang w:val="en-US"/>
+        </w:rPr>
+        <w:t>202?.</w:t>
+      </w:r>
+      <w:proofErr w:type="gramEnd"/>
+      <w:r>
+        <w:rPr>
+          <w:lang w:val="en-US"/>
+        </w:rPr>
+        <w:t xml:space="preserve"> </w:t>
       </w:r>
       <w:r>
         <w:t xml:space="preserve">Disponível em: </w:t>
       </w:r>
-      <w:hyperlink r:id="rId31" w:tgtFrame="_new" w:history="1">
+      <w:hyperlink r:id="rId37" w:tgtFrame="_new" w:history="1">
         <w:r>
           <w:rPr>
             <w:rStyle w:val="Hyperlink"/>
@@ -6452,8 +7410,17 @@
           <w:b/>
           <w:bCs/>
         </w:rPr>
-        <w:t>Revista Semiárido de Visu</w:t>
-      </w:r>
+        <w:t xml:space="preserve">Revista Semiárido de </w:t>
+      </w:r>
+      <w:proofErr w:type="spellStart"/>
+      <w:r>
+        <w:rPr>
+          <w:b/>
+          <w:bCs/>
+        </w:rPr>
+        <w:t>Visu</w:t>
+      </w:r>
+      <w:proofErr w:type="spellEnd"/>
       <w:r>
         <w:t>, [</w:t>
       </w:r>
@@ -6465,9 +7432,17 @@
         <w:t>s. l.</w:t>
       </w:r>
       <w:r>
-        <w:t xml:space="preserve">], v. 12, n. 2, 2024. DOI: 10.31416/rsdv.v12i2.598. Disponível em: </w:t>
-      </w:r>
-      <w:hyperlink r:id="rId32" w:tgtFrame="_new" w:history="1">
+        <w:t>], v. 12, n. 2, 2024. DOI: 10.31416/</w:t>
+      </w:r>
+      <w:proofErr w:type="gramStart"/>
+      <w:r>
+        <w:t>rsdv.v</w:t>
+      </w:r>
+      <w:proofErr w:type="gramEnd"/>
+      <w:r>
+        <w:t xml:space="preserve">12i2.598. Disponível em: </w:t>
+      </w:r>
+      <w:hyperlink r:id="rId38" w:tgtFrame="_new" w:history="1">
         <w:r>
           <w:rPr>
             <w:rStyle w:val="Hyperlink"/>
@@ -6486,34 +7461,106 @@
     <w:p>
       <w:pPr>
         <w:pStyle w:val="TF-refernciasITEM"/>
-        <w:rPr>
-          <w:color w:val="000000" w:themeColor="text1"/>
-        </w:rPr>
-      </w:pPr>
-      <w:r>
-        <w:t xml:space="preserve">SILVA, A. R. da C. </w:t>
+      </w:pPr>
+      <w:r>
+        <w:rPr>
+          <w:lang w:val="en-US"/>
+        </w:rPr>
+        <w:t xml:space="preserve">SAP. </w:t>
       </w:r>
       <w:r>
         <w:rPr>
           <w:b/>
           <w:bCs/>
-        </w:rPr>
-        <w:t>SIGMA –</w:t>
-      </w:r>
-      <w:r>
-        <w:t xml:space="preserve"> </w:t>
-      </w:r>
+          <w:lang w:val="en-US"/>
+        </w:rPr>
+        <w:t xml:space="preserve">What is </w:t>
+      </w:r>
+      <w:proofErr w:type="gramStart"/>
       <w:r>
         <w:rPr>
           <w:b/>
           <w:bCs/>
+          <w:lang w:val="en-US"/>
+        </w:rPr>
+        <w:t>ERP?</w:t>
+      </w:r>
+      <w:r>
+        <w:rPr>
+          <w:lang w:val="en-US"/>
+        </w:rPr>
+        <w:t>.</w:t>
+      </w:r>
+      <w:proofErr w:type="gramEnd"/>
+      <w:r>
+        <w:rPr>
+          <w:lang w:val="en-US"/>
+        </w:rPr>
+        <w:t xml:space="preserve"> SAP, 2023. </w:t>
+      </w:r>
+      <w:r>
+        <w:t xml:space="preserve">Disponível em: </w:t>
+      </w:r>
+      <w:hyperlink r:id="rId39" w:tgtFrame="_new" w:history="1">
+        <w:r>
+          <w:rPr>
+            <w:rStyle w:val="Hyperlink"/>
+            <w:noProof w:val="0"/>
+          </w:rPr>
+          <w:t>https://www.sap.com/products/erp/what-is-erp.html</w:t>
+        </w:r>
+      </w:hyperlink>
+      <w:r>
+        <w:t>. Acesso em: 9 abr. 2026.</w:t>
+      </w:r>
+    </w:p>
+    <w:p>
+      <w:pPr>
+        <w:pStyle w:val="TF-refernciasITEM"/>
+        <w:rPr>
+          <w:color w:val="000000" w:themeColor="text1"/>
+        </w:rPr>
+      </w:pPr>
+      <w:r>
+        <w:t xml:space="preserve">SILVA, A. R. </w:t>
+      </w:r>
+      <w:proofErr w:type="spellStart"/>
+      <w:r>
+        <w:t>da</w:t>
+      </w:r>
+      <w:proofErr w:type="spellEnd"/>
+      <w:r>
+        <w:t xml:space="preserve"> C. </w:t>
+      </w:r>
+      <w:r>
+        <w:rPr>
+          <w:b/>
+          <w:bCs/>
+        </w:rPr>
+        <w:t>SIGMA –</w:t>
+      </w:r>
+      <w:r>
+        <w:t xml:space="preserve"> </w:t>
+      </w:r>
+      <w:r>
+        <w:rPr>
+          <w:b/>
+          <w:bCs/>
         </w:rPr>
         <w:t>Sistema de Gestão e Acompanhamento Móvel de Alunos Portadores de Necessidades Educacionais Especiais</w:t>
       </w:r>
       <w:r>
-        <w:t xml:space="preserve">. Orientador: Leandro Krug Wives. 2019. Trabalho de Conclusão de Curso (Bacharelado em Ciência da Computação) – Universidade Federal do Rio Grande do Sul, Porto Alegre, 2019. Disponível em: </w:t>
-      </w:r>
-      <w:hyperlink r:id="rId33" w:history="1">
+        <w:t xml:space="preserve">. Orientador: Leandro Krug </w:t>
+      </w:r>
+      <w:proofErr w:type="spellStart"/>
+      <w:r>
+        <w:t>Wives</w:t>
+      </w:r>
+      <w:proofErr w:type="spellEnd"/>
+      <w:r>
+        <w:t xml:space="preserve">. 2019. Trabalho de Conclusão de Curso (Bacharelado em Ciência da Computação) – Universidade Federal do Rio Grande do Sul, Porto Alegre, 2019. Disponível em: </w:t>
+      </w:r>
+      <w:hyperlink r:id="rId40" w:history="1">
         <w:r>
           <w:rPr>
             <w:rStyle w:val="Hyperlink"/>
@@ -6537,7 +7584,6 @@
         <w:rPr>
           <w:color w:val="000000" w:themeColor="text1"/>
         </w:rPr>
-        <w:lastRenderedPageBreak/>
         <w:t>SILVA, L</w:t>
       </w:r>
       <w:r>
@@ -6611,9 +7657,17 @@
         <w:t>Revista Interface Tecnológica</w:t>
       </w:r>
       <w:r>
-        <w:t xml:space="preserve">, Taquaritinga, v. 20, n. 1, p. 76–86, 2023. DOI: 10.31510/infa.v20i1.1634. Disponível em: </w:t>
-      </w:r>
-      <w:hyperlink r:id="rId34" w:history="1">
+        <w:t>, Taquaritinga, v. 20, n. 1, p. 76–86, 2023. DOI: 10.31510/</w:t>
+      </w:r>
+      <w:proofErr w:type="gramStart"/>
+      <w:r>
+        <w:t>infa.v</w:t>
+      </w:r>
+      <w:proofErr w:type="gramEnd"/>
+      <w:r>
+        <w:t xml:space="preserve">20i1.1634. Disponível em: </w:t>
+      </w:r>
+      <w:hyperlink r:id="rId41" w:history="1">
         <w:r>
           <w:rPr>
             <w:rStyle w:val="Hyperlink"/>
@@ -6625,11 +7679,33 @@
       <w:r>
         <w:t xml:space="preserve">. </w:t>
       </w:r>
-      <w:r>
-        <w:rPr>
-          <w:lang w:val="en-US"/>
-        </w:rPr>
-        <w:t xml:space="preserve">Acesso em: </w:t>
+      <w:proofErr w:type="spellStart"/>
+      <w:r>
+        <w:rPr>
+          <w:lang w:val="en-US"/>
+        </w:rPr>
+        <w:t>Acesso</w:t>
+      </w:r>
+      <w:proofErr w:type="spellEnd"/>
+      <w:r>
+        <w:rPr>
+          <w:lang w:val="en-US"/>
+        </w:rPr>
+        <w:t xml:space="preserve"> </w:t>
+      </w:r>
+      <w:proofErr w:type="spellStart"/>
+      <w:r>
+        <w:rPr>
+          <w:lang w:val="en-US"/>
+        </w:rPr>
+        <w:t>em</w:t>
+      </w:r>
+      <w:proofErr w:type="spellEnd"/>
+      <w:r>
+        <w:rPr>
+          <w:lang w:val="en-US"/>
+        </w:rPr>
+        <w:t xml:space="preserve">: </w:t>
       </w:r>
       <w:r>
         <w:rPr>
@@ -6735,7 +7811,7 @@
       <w:r>
         <w:t xml:space="preserve"> </w:t>
       </w:r>
-      <w:hyperlink r:id="rId35" w:history="1">
+      <w:hyperlink r:id="rId42" w:history="1">
         <w:r>
           <w:rPr>
             <w:rStyle w:val="Hyperlink"/>
@@ -6747,11 +7823,33 @@
       <w:r>
         <w:t xml:space="preserve">. </w:t>
       </w:r>
-      <w:r>
-        <w:rPr>
-          <w:lang w:val="en-US"/>
-        </w:rPr>
-        <w:t xml:space="preserve">Acesso em: </w:t>
+      <w:proofErr w:type="spellStart"/>
+      <w:r>
+        <w:rPr>
+          <w:lang w:val="en-US"/>
+        </w:rPr>
+        <w:t>Acesso</w:t>
+      </w:r>
+      <w:proofErr w:type="spellEnd"/>
+      <w:r>
+        <w:rPr>
+          <w:lang w:val="en-US"/>
+        </w:rPr>
+        <w:t xml:space="preserve"> </w:t>
+      </w:r>
+      <w:proofErr w:type="spellStart"/>
+      <w:r>
+        <w:rPr>
+          <w:lang w:val="en-US"/>
+        </w:rPr>
+        <w:t>em</w:t>
+      </w:r>
+      <w:proofErr w:type="spellEnd"/>
+      <w:r>
+        <w:rPr>
+          <w:lang w:val="en-US"/>
+        </w:rPr>
+        <w:t xml:space="preserve">: </w:t>
       </w:r>
       <w:r>
         <w:rPr>
@@ -6831,7 +7929,7 @@
       <w:r>
         <w:t xml:space="preserve">Disponível em: </w:t>
       </w:r>
-      <w:hyperlink r:id="rId36" w:tgtFrame="_new" w:history="1">
+      <w:hyperlink r:id="rId43" w:tgtFrame="_new" w:history="1">
         <w:r>
           <w:rPr>
             <w:rStyle w:val="Hyperlink"/>
@@ -6844,52 +7942,11 @@
         <w:t>. Acesso em: 15 abr. 2026.</w:t>
       </w:r>
     </w:p>
-    <w:p>
-      <w:pPr>
-        <w:pStyle w:val="TF-refernciasITEM"/>
-        <w:rPr>
-          <w:b/>
-          <w:bCs/>
-        </w:rPr>
-      </w:pPr>
-    </w:p>
-    <w:p>
-      <w:pPr>
-        <w:pStyle w:val="TF-refernciasITEM"/>
-        <w:rPr>
-          <w:b/>
-          <w:bCs/>
-        </w:rPr>
-      </w:pPr>
-      <w:r>
-        <w:rPr>
-          <w:b/>
-          <w:bCs/>
-        </w:rPr>
-        <w:t>OBSERVAÇÕES</w:t>
-      </w:r>
-    </w:p>
-    <w:p>
-      <w:pPr>
-        <w:pStyle w:val="TF-TEXTO"/>
-        <w:rPr>
-          <w:b/>
-          <w:bCs/>
-        </w:rPr>
-      </w:pPr>
-      <w:r>
-        <w:rPr>
-          <w:b/>
-          <w:bCs/>
-        </w:rPr>
-        <w:t>A figura apresentada na introdução justifica-se pela necessidade, no formato de TCC1 aplicado, de apresentar o cenário atual com informações detalhadas sobre a empresa. Agora, é necessário incluir o fluxo das atividades atuais relacionadas ao processo em que o sistema proposto será inserido, bem como descrever de forma detalhada o comportamento desse processo. Além disso, o TCC tem como objetivo principal propor melhorias para a empresa familiar dos integrantes do projeto.</w:t>
-      </w:r>
-    </w:p>
     <w:sectPr>
-      <w:headerReference w:type="default" r:id="rId37"/>
-      <w:footerReference w:type="even" r:id="rId38"/>
-      <w:footerReference w:type="default" r:id="rId39"/>
-      <w:headerReference w:type="first" r:id="rId40"/>
+      <w:headerReference w:type="default" r:id="rId44"/>
+      <w:footerReference w:type="even" r:id="rId45"/>
+      <w:footerReference w:type="default" r:id="rId46"/>
+      <w:headerReference w:type="first" r:id="rId47"/>
       <w:pgSz w:w="11907" w:h="16840" w:code="9"/>
       <w:pgMar w:top="1134" w:right="1134" w:bottom="1134" w:left="1701" w:header="720" w:footer="720" w:gutter="0"/>
       <w:pgNumType w:start="1"/>
@@ -11035,7 +12092,12 @@
 </file>
 
 <file path=customXml/item1.xml><?xml version="1.0" encoding="utf-8"?>
-<b:Sources xmlns:b="http://schemas.openxmlformats.org/officeDocument/2006/bibliography" xmlns="http://schemas.openxmlformats.org/officeDocument/2006/bibliography" SelectedStyle="" StyleName=""/>
+<?mso-contentType ?>
+<FormTemplates xmlns="http://schemas.microsoft.com/sharepoint/v3/contenttype/forms">
+  <Display>DocumentLibraryForm</Display>
+  <Edit>DocumentLibraryForm</Edit>
+  <New>DocumentLibraryForm</New>
+</FormTemplates>
 </file>
 
 <file path=customXml/item2.xml><?xml version="1.0" encoding="utf-8"?>
@@ -11279,18 +12341,13 @@
 </file>
 
 <file path=customXml/item4.xml><?xml version="1.0" encoding="utf-8"?>
-<?mso-contentType ?>
-<FormTemplates xmlns="http://schemas.microsoft.com/sharepoint/v3/contenttype/forms">
-  <Display>DocumentLibraryForm</Display>
-  <Edit>DocumentLibraryForm</Edit>
-  <New>DocumentLibraryForm</New>
-</FormTemplates>
+<b:Sources xmlns:b="http://schemas.openxmlformats.org/officeDocument/2006/bibliography" xmlns="http://schemas.openxmlformats.org/officeDocument/2006/bibliography" SelectedStyle="" StyleName=""/>
 </file>
 
 <file path=customXml/itemProps1.xml><?xml version="1.0" encoding="utf-8"?>
-<ds:datastoreItem xmlns:ds="http://schemas.openxmlformats.org/officeDocument/2006/customXml" ds:itemID="{DE59AE69-FFD3-447D-A459-A5473AFD6F3C}">
+<ds:datastoreItem xmlns:ds="http://schemas.openxmlformats.org/officeDocument/2006/customXml" ds:itemID="{30EC004F-0B04-4D45-8B44-20CF12AD12D5}">
   <ds:schemaRefs>
-    <ds:schemaRef ds:uri="http://schemas.openxmlformats.org/officeDocument/2006/bibliography"/>
+    <ds:schemaRef ds:uri="http://schemas.microsoft.com/sharepoint/v3/contenttype/forms"/>
   </ds:schemaRefs>
 </ds:datastoreItem>
 </file>
@@ -11326,9 +12383,9 @@
 </file>
 
 <file path=customXml/itemProps4.xml><?xml version="1.0" encoding="utf-8"?>
-<ds:datastoreItem xmlns:ds="http://schemas.openxmlformats.org/officeDocument/2006/customXml" ds:itemID="{30EC004F-0B04-4D45-8B44-20CF12AD12D5}">
+<ds:datastoreItem xmlns:ds="http://schemas.openxmlformats.org/officeDocument/2006/customXml" ds:itemID="{DE59AE69-FFD3-447D-A459-A5473AFD6F3C}">
   <ds:schemaRefs>
-    <ds:schemaRef ds:uri="http://schemas.microsoft.com/sharepoint/v3/contenttype/forms"/>
+    <ds:schemaRef ds:uri="http://schemas.openxmlformats.org/officeDocument/2006/bibliography"/>
   </ds:schemaRefs>
 </ds:datastoreItem>
 </file>
</xml_diff>